<commit_message>
Simplify the manager summary: plain language, simple chart, no publication-fit section
Co-Authored-By: Claude Sonnet 5.5 <noreply@anthropic.com>
</commit_message>
<xml_diff>
--- a/paper/manager_copy/Paper_Abstract_and_Summary.docx
+++ b/paper/manager_copy/Paper_Abstract_and_Summary.docx
@@ -11,15 +11,15 @@
       <w:r>
         <w:rPr>
           <w:b/>
-          <w:sz w:val="32"/>
+          <w:sz w:val="34"/>
         </w:rPr>
-        <w:t>What Does Fine-Tuning Buy a Small Vision-Language Decision Model?</w:t>
+        <w:t>Is Fine-Tuning a Small AI Model Worth It?</w:t>
       </w:r>
     </w:p>
     <w:p>
       <w:pPr>
         <w:keepNext w:val="0"/>
-        <w:spacing w:after="80"/>
+        <w:spacing w:after="60"/>
         <w:jc w:val="center"/>
       </w:pPr>
       <w:r>
@@ -27,7 +27,27 @@
           <w:b/>
           <w:sz w:val="24"/>
         </w:rPr>
-        <w:t>Abstract and summary of the paper</w:t>
+        <w:t>Plain-language abstract and summary of the research paper</w:t>
+      </w:r>
+    </w:p>
+    <w:p>
+      <w:pPr>
+        <w:keepNext w:val="0"/>
+        <w:spacing w:after="40"/>
+        <w:jc w:val="center"/>
+      </w:pPr>
+      <w:r>
+        <w:rPr>
+          <w:sz w:val="20"/>
+        </w:rPr>
+        <w:t xml:space="preserve">Paper title: </w:t>
+      </w:r>
+      <w:r>
+        <w:rPr>
+          <w:i/>
+          <w:sz w:val="20"/>
+        </w:rPr>
+        <w:t>What Does Fine-Tuning Buy a Small Vision-Language Decision Model?</w:t>
       </w:r>
     </w:p>
     <w:p>
@@ -48,27 +68,7 @@
         <w:pStyle w:val="Heading2"/>
       </w:pPr>
       <w:r>
-        <w:t>Abstract</w:t>
-      </w:r>
-    </w:p>
-    <w:p>
-      <w:pPr>
-        <w:keepNext w:val="0"/>
-        <w:spacing w:after="120"/>
-      </w:pPr>
-      <w:r>
-        <w:rPr>
-          <w:sz w:val="21"/>
-        </w:rPr>
-        <w:t>A decision model answers typed questions about a state made of text and images by returning a probability for every allowed option in one forward pass, without generating text. We study what fine-tuning a small vision-language model (Qwen3-VL-2B with LoRA and a learned option-scoring head) buys over the baselines a practitioner would try first, using an implementation that trains on an 8 GB laptop GPU. Measured against the base model with post-hoc temperature scaling, fine-tuning raises accuracy by 6.9 points (95% CI 5.5 to 8.3) on 16 held-out datasets, but by only 2.8 points (1.2 to 4.4) on 11 further datasets that influenced no design decision, and not significantly on three zero-shot sources. Temperature scaling alone removes 74 to 87% of the calibration error that separates the raw base model from the fine-tuned one, so most of the calibration benefit that is easy to attribute to fine-tuning is not due to it. Over three seeds, training on a broader mix of tasks beats a narrower mix on all five held-out collections (+1.3 to +5.1 points), whereas a learned answer head is no more accurate than a plain letter-logit readout, which generalises better to unseen sources but cannot handle more than 26 options. The fine-tuned model falls below the base model on questions with more than ten options; averaging over option orders recovers part of the gap. We report every comparison with confidence intervals and state the limits of the evidence.</w:t>
-      </w:r>
-    </w:p>
-    <w:p>
-      <w:pPr>
-        <w:pStyle w:val="Heading2"/>
-      </w:pPr>
-      <w:r>
-        <w:t>The question, in plain language</w:t>
+        <w:t>In short</w:t>
       </w:r>
     </w:p>
     <w:p>
@@ -78,22 +78,22 @@
       </w:pPr>
       <w:r>
         <w:rPr>
-          <w:sz w:val="21"/>
+          <w:sz w:val="22"/>
         </w:rPr>
-        <w:t xml:space="preserve">Many systems must pick one answer from a fixed list and say how confident they are: routing a request, flagging a message, choosing a tool. We took a small publicly available AI model that reads text and images and fine-tuned it for exactly this job. The paper asks a plain question: </w:t>
+        <w:t xml:space="preserve">We took a small, publicly available AI model that can read text and pictures, and trained it further for one job: choose one answer from a fixed list and say how sure it is. Then we measured how much better it is than the same model left untouched. </w:t>
       </w:r>
       <w:r>
         <w:rPr>
           <w:b/>
-          <w:sz w:val="21"/>
+          <w:sz w:val="22"/>
         </w:rPr>
-        <w:t>after all that work, how much better is it than the same untouched model with a simple, free adjustment of its confidence?</w:t>
+        <w:t>On new data it is more accurate, but the gain is smaller than it first looks</w:t>
       </w:r>
       <w:r>
         <w:rPr>
-          <w:sz w:val="21"/>
+          <w:sz w:val="22"/>
         </w:rPr>
-        <w:t xml:space="preserve"> Earlier comparisons usually leave that adjustment out, which makes fine-tuning look better than it is.</w:t>
+        <w:t>: about 3 percentage points on datasets that played no part in our decisions, compared with about 7 on the datasets we used while developing it. Much of the improvement in how well it judges its own certainty can be had for free, with a simple adjustment to the untouched model. The change that helped most was training on a wider variety of tasks. One weakness remains: when a question has more than 10 possible answers, the trained model does worse than the untouched one.</w:t>
       </w:r>
     </w:p>
     <w:p>
@@ -101,7 +101,40 @@
         <w:pStyle w:val="Heading2"/>
       </w:pPr>
       <w:r>
-        <w:t>Key findings</w:t>
+        <w:t>What we wanted to find out</w:t>
+      </w:r>
+    </w:p>
+    <w:p>
+      <w:pPr>
+        <w:keepNext w:val="0"/>
+        <w:spacing w:after="80"/>
+      </w:pPr>
+      <w:r>
+        <w:rPr>
+          <w:sz w:val="22"/>
+        </w:rPr>
+        <w:t xml:space="preserve">Systems that must pick one answer from a list, such as sorting a request, flagging a message or choosing a tool, need both a correct answer and an honest sense of how sure they are. The question was simple: </w:t>
+      </w:r>
+      <w:r>
+        <w:rPr>
+          <w:b/>
+          <w:sz w:val="22"/>
+        </w:rPr>
+        <w:t>after all the training work, how much better is the model than the same model left untouched, once the untouched model is given the same simple adjustment to its certainty?</w:t>
+      </w:r>
+      <w:r>
+        <w:rPr>
+          <w:sz w:val="22"/>
+        </w:rPr>
+        <w:t xml:space="preserve"> Earlier comparisons usually leave that adjustment out, which makes training look better than it is.</w:t>
+      </w:r>
+    </w:p>
+    <w:p>
+      <w:pPr>
+        <w:pStyle w:val="Heading2"/>
+      </w:pPr>
+      <w:r>
+        <w:t>What we found</w:t>
       </w:r>
     </w:p>
     <w:p>
@@ -113,15 +146,15 @@
       <w:r>
         <w:rPr>
           <w:b/>
-          <w:sz w:val="21"/>
+          <w:sz w:val="22"/>
         </w:rPr>
-        <w:t>Fine-tuning helps, by less than it first appears.</w:t>
+        <w:t>It is more accurate, but by less than it first appears.</w:t>
       </w:r>
       <w:r>
         <w:rPr>
-          <w:sz w:val="21"/>
+          <w:sz w:val="22"/>
         </w:rPr>
-        <w:t xml:space="preserve"> About 7 points more accurate on 16 held-out datasets, but about 3 points on 11 further datasets that played no role in any decision, and no clear gain on three zero-shot sources.</w:t>
+        <w:t xml:space="preserve"> About 7 points better on 16 datasets used while developing it, but only about 3 points better on 11 datasets used for no decision. On 3 further sources there was no clear gain.</w:t>
       </w:r>
     </w:p>
     <w:p>
@@ -133,15 +166,15 @@
       <w:r>
         <w:rPr>
           <w:b/>
-          <w:sz w:val="21"/>
+          <w:sz w:val="22"/>
         </w:rPr>
-        <w:t>Most of the confidence improvement is free.</w:t>
+        <w:t>Most of the better judgement of certainty comes for free.</w:t>
       </w:r>
       <w:r>
         <w:rPr>
-          <w:sz w:val="21"/>
+          <w:sz w:val="22"/>
         </w:rPr>
-        <w:t xml:space="preserve"> A simple one-number adjustment (temperature scaling) applied to the untouched model removes 74 to 87% of the confidence error that fine-tuning is usually credited with fixing.</w:t>
+        <w:t xml:space="preserve"> The untouched model is overconfident. A one-number correction fixes about three quarters or more of that (74% to 87%), so training deserves less of the credit.</w:t>
       </w:r>
     </w:p>
     <w:p>
@@ -153,15 +186,15 @@
       <w:r>
         <w:rPr>
           <w:b/>
-          <w:sz w:val="21"/>
+          <w:sz w:val="22"/>
         </w:rPr>
-        <w:t>Training on more kinds of tasks was the one change that helped consistently</w:t>
+        <w:t>Training on more kinds of tasks was the one change that helped every time</w:t>
       </w:r>
       <w:r>
         <w:rPr>
-          <w:sz w:val="21"/>
+          <w:sz w:val="22"/>
         </w:rPr>
-        <w:t>: +1.3 to +5.1 points over five collections, averaged over three training runs each.</w:t>
+        <w:t>: between 1 and 5 points better on all five groups of test data, averaged over three separate training runs.</w:t>
       </w:r>
     </w:p>
     <w:p>
@@ -173,15 +206,15 @@
       <w:r>
         <w:rPr>
           <w:b/>
-          <w:sz w:val="21"/>
+          <w:sz w:val="22"/>
         </w:rPr>
-        <w:t>A learned answer-scoring component is not more accurate than simply reading the model's letter probabilities.</w:t>
+        <w:t>A special answer-picking part we added was not more accurate than the model's own simple way of choosing.</w:t>
       </w:r>
       <w:r>
         <w:rPr>
-          <w:sz w:val="21"/>
+          <w:sz w:val="22"/>
         </w:rPr>
-        <w:t xml:space="preserve"> It is better calibrated and the only option once a question has more than 26 choices.</w:t>
+        <w:t xml:space="preserve"> It is better at stating how sure it is, and it is the only choice once there are more than 26 possible answers.</w:t>
       </w:r>
     </w:p>
     <w:p>
@@ -193,15 +226,20 @@
       <w:r>
         <w:rPr>
           <w:b/>
-          <w:sz w:val="21"/>
+          <w:sz w:val="22"/>
         </w:rPr>
-        <w:t>A weakness remains.</w:t>
+        <w:t>A weakness remains for long lists of answers.</w:t>
       </w:r>
       <w:r>
         <w:rPr>
-          <w:sz w:val="21"/>
+          <w:sz w:val="22"/>
         </w:rPr>
-        <w:t xml:space="preserve"> On questions with more than ten options the fine-tuned model is below the untouched model; averaging over option orders recovers part of the gap, and padding the training data with extra options did not help.</w:t>
+        <w:t xml:space="preserve"> With more than 10 choices the trained model scores below the untouched one. Shuffling the order of the choices and averaging helps a little; adding extra training examples with many choices did not.</w:t>
+      </w:r>
+    </w:p>
+    <w:p>
+      <w:r>
+        <w:br w:type="page"/>
       </w:r>
     </w:p>
     <w:p>
@@ -225,7 +263,7 @@
       </w:r>
       <w:r>
         <w:rPr/>
-        <w:t xml:space="preserve"> Accuracy (%). The base model with temperature scaling is the strongest simple baseline; the last column is the released model minus that baseline, with a 95% interval.</w:t>
+        <w:t xml:space="preserve"> Share of questions answered correctly (%). The "untouched model" has had a simple adjustment to its certainty, so the comparison is fair. The range shows how far each gain could move by chance.</w:t>
       </w:r>
     </w:p>
     <w:tbl>
@@ -248,7 +286,7 @@
         </w:trPr>
         <w:tc>
           <w:tcPr>
-            <w:tcW w:type="dxa" w:w="3888"/>
+            <w:tcW w:type="dxa" w:w="3600"/>
             <w:tcBorders>
               <w:top w:val="single" w:sz="12" w:space="0" w:color="000000"/>
               <w:bottom w:val="single" w:sz="6" w:space="0" w:color="000000"/>
@@ -262,31 +300,9 @@
             <w:r>
               <w:rPr>
                 <w:b/>
-                <w:sz w:val="18"/>
+                <w:sz w:val="19"/>
               </w:rPr>
-              <w:t>Test collection</w:t>
-            </w:r>
-          </w:p>
-        </w:tc>
-        <w:tc>
-          <w:tcPr>
-            <w:tcW w:type="dxa" w:w="1944"/>
-            <w:tcBorders>
-              <w:top w:val="single" w:sz="12" w:space="0" w:color="000000"/>
-              <w:bottom w:val="single" w:sz="6" w:space="0" w:color="000000"/>
-            </w:tcBorders>
-          </w:tcPr>
-          <w:p>
-            <w:pPr>
-              <w:spacing w:after="20" w:before="20" w:line="240" w:lineRule="auto"/>
-              <w:jc w:val="center"/>
-            </w:pPr>
-            <w:r>
-              <w:rPr>
-                <w:b/>
-                <w:sz w:val="18"/>
-              </w:rPr>
-              <w:t>Base model + temp. scaling</w:t>
+              <w:t>Test data</w:t>
             </w:r>
           </w:p>
         </w:tc>
@@ -306,15 +322,15 @@
             <w:r>
               <w:rPr>
                 <w:b/>
-                <w:sz w:val="18"/>
+                <w:sz w:val="19"/>
               </w:rPr>
-              <w:t>Fine-tuned model</w:t>
+              <w:t>Untouched model</w:t>
             </w:r>
           </w:p>
         </w:tc>
         <w:tc>
           <w:tcPr>
-            <w:tcW w:type="dxa" w:w="2664"/>
+            <w:tcW w:type="dxa" w:w="1728"/>
             <w:tcBorders>
               <w:top w:val="single" w:sz="12" w:space="0" w:color="000000"/>
               <w:bottom w:val="single" w:sz="6" w:space="0" w:color="000000"/>
@@ -328,9 +344,31 @@
             <w:r>
               <w:rPr>
                 <w:b/>
-                <w:sz w:val="18"/>
+                <w:sz w:val="19"/>
               </w:rPr>
-              <w:t>Difference</w:t>
+              <w:t>Fine-tuned model</w:t>
+            </w:r>
+          </w:p>
+        </w:tc>
+        <w:tc>
+          <w:tcPr>
+            <w:tcW w:type="dxa" w:w="2736"/>
+            <w:tcBorders>
+              <w:top w:val="single" w:sz="12" w:space="0" w:color="000000"/>
+              <w:bottom w:val="single" w:sz="6" w:space="0" w:color="000000"/>
+            </w:tcBorders>
+          </w:tcPr>
+          <w:p>
+            <w:pPr>
+              <w:spacing w:after="20" w:before="20" w:line="240" w:lineRule="auto"/>
+              <w:jc w:val="center"/>
+            </w:pPr>
+            <w:r>
+              <w:rPr>
+                <w:b/>
+                <w:sz w:val="19"/>
+              </w:rPr>
+              <w:t>Gain and likely range</w:t>
             </w:r>
           </w:p>
         </w:tc>
@@ -341,7 +379,7 @@
         </w:trPr>
         <w:tc>
           <w:tcPr>
-            <w:tcW w:type="dxa" w:w="3888"/>
+            <w:tcW w:type="dxa" w:w="3600"/>
           </w:tcPr>
           <w:p>
             <w:pPr>
@@ -350,15 +388,15 @@
             </w:pPr>
             <w:r>
               <w:rPr>
-                <w:sz w:val="18"/>
+                <w:sz w:val="19"/>
               </w:rPr>
-              <w:t>16 open datasets (3,678 questions)</w:t>
+              <w:t>16 datasets used while developing</w:t>
             </w:r>
           </w:p>
         </w:tc>
         <w:tc>
           <w:tcPr>
-            <w:tcW w:type="dxa" w:w="1944"/>
+            <w:tcW w:type="dxa" w:w="1728"/>
           </w:tcPr>
           <w:p>
             <w:pPr>
@@ -367,7 +405,7 @@
             </w:pPr>
             <w:r>
               <w:rPr>
-                <w:sz w:val="18"/>
+                <w:sz w:val="19"/>
               </w:rPr>
               <w:t>71.1</w:t>
             </w:r>
@@ -384,7 +422,7 @@
             </w:pPr>
             <w:r>
               <w:rPr>
-                <w:sz w:val="18"/>
+                <w:sz w:val="19"/>
               </w:rPr>
               <w:t>78.0</w:t>
             </w:r>
@@ -392,7 +430,7 @@
         </w:tc>
         <w:tc>
           <w:tcPr>
-            <w:tcW w:type="dxa" w:w="2664"/>
+            <w:tcW w:type="dxa" w:w="2736"/>
           </w:tcPr>
           <w:p>
             <w:pPr>
@@ -401,9 +439,9 @@
             </w:pPr>
             <w:r>
               <w:rPr>
-                <w:sz w:val="18"/>
+                <w:sz w:val="19"/>
               </w:rPr>
-              <w:t>+6.9 [+5.5, +8.3]</w:t>
+              <w:t>+6.9  (+5.5 to +8.3)</w:t>
             </w:r>
           </w:p>
         </w:tc>
@@ -414,7 +452,7 @@
         </w:trPr>
         <w:tc>
           <w:tcPr>
-            <w:tcW w:type="dxa" w:w="3888"/>
+            <w:tcW w:type="dxa" w:w="3600"/>
           </w:tcPr>
           <w:p>
             <w:pPr>
@@ -423,15 +461,15 @@
             </w:pPr>
             <w:r>
               <w:rPr>
-                <w:sz w:val="18"/>
+                <w:sz w:val="19"/>
               </w:rPr>
-              <w:t>11 confirmation datasets (2,306 questions)</w:t>
+              <w:t>11 datasets used for no decision</w:t>
             </w:r>
           </w:p>
         </w:tc>
         <w:tc>
           <w:tcPr>
-            <w:tcW w:type="dxa" w:w="1944"/>
+            <w:tcW w:type="dxa" w:w="1728"/>
           </w:tcPr>
           <w:p>
             <w:pPr>
@@ -440,7 +478,7 @@
             </w:pPr>
             <w:r>
               <w:rPr>
-                <w:sz w:val="18"/>
+                <w:sz w:val="19"/>
               </w:rPr>
               <w:t>69.2</w:t>
             </w:r>
@@ -457,7 +495,7 @@
             </w:pPr>
             <w:r>
               <w:rPr>
-                <w:sz w:val="18"/>
+                <w:sz w:val="19"/>
               </w:rPr>
               <w:t>72.0</w:t>
             </w:r>
@@ -465,7 +503,7 @@
         </w:tc>
         <w:tc>
           <w:tcPr>
-            <w:tcW w:type="dxa" w:w="2664"/>
+            <w:tcW w:type="dxa" w:w="2736"/>
           </w:tcPr>
           <w:p>
             <w:pPr>
@@ -474,9 +512,9 @@
             </w:pPr>
             <w:r>
               <w:rPr>
-                <w:sz w:val="18"/>
+                <w:sz w:val="19"/>
               </w:rPr>
-              <w:t>+2.8 [+1.2, +4.4]</w:t>
+              <w:t>+2.8  (+1.2 to +4.4)</w:t>
             </w:r>
           </w:p>
         </w:tc>
@@ -487,7 +525,7 @@
         </w:trPr>
         <w:tc>
           <w:tcPr>
-            <w:tcW w:type="dxa" w:w="3888"/>
+            <w:tcW w:type="dxa" w:w="3600"/>
           </w:tcPr>
           <w:p>
             <w:pPr>
@@ -496,15 +534,15 @@
             </w:pPr>
             <w:r>
               <w:rPr>
-                <w:sz w:val="18"/>
+                <w:sz w:val="19"/>
               </w:rPr>
-              <w:t>2 fresh datasets (600 questions)</w:t>
+              <w:t>2 more development datasets</w:t>
             </w:r>
           </w:p>
         </w:tc>
         <w:tc>
           <w:tcPr>
-            <w:tcW w:type="dxa" w:w="1944"/>
+            <w:tcW w:type="dxa" w:w="1728"/>
           </w:tcPr>
           <w:p>
             <w:pPr>
@@ -513,7 +551,7 @@
             </w:pPr>
             <w:r>
               <w:rPr>
-                <w:sz w:val="18"/>
+                <w:sz w:val="19"/>
               </w:rPr>
               <w:t>61.2</w:t>
             </w:r>
@@ -530,7 +568,7 @@
             </w:pPr>
             <w:r>
               <w:rPr>
-                <w:sz w:val="18"/>
+                <w:sz w:val="19"/>
               </w:rPr>
               <w:t>76.2</w:t>
             </w:r>
@@ -538,7 +576,7 @@
         </w:tc>
         <w:tc>
           <w:tcPr>
-            <w:tcW w:type="dxa" w:w="2664"/>
+            <w:tcW w:type="dxa" w:w="2736"/>
           </w:tcPr>
           <w:p>
             <w:pPr>
@@ -547,9 +585,9 @@
             </w:pPr>
             <w:r>
               <w:rPr>
-                <w:sz w:val="18"/>
+                <w:sz w:val="19"/>
               </w:rPr>
-              <w:t>+15.0 [+11.2, +18.8]</w:t>
+              <w:t>+15.0  (+11.2 to +18.8)</w:t>
             </w:r>
           </w:p>
         </w:tc>
@@ -560,7 +598,7 @@
         </w:trPr>
         <w:tc>
           <w:tcPr>
-            <w:tcW w:type="dxa" w:w="3888"/>
+            <w:tcW w:type="dxa" w:w="3600"/>
             <w:tcBorders>
               <w:bottom w:val="single" w:sz="12" w:space="0" w:color="000000"/>
             </w:tcBorders>
@@ -572,15 +610,15 @@
             </w:pPr>
             <w:r>
               <w:rPr>
-                <w:sz w:val="18"/>
+                <w:sz w:val="19"/>
               </w:rPr>
-              <w:t>3 zero-shot sources (720 questions)</w:t>
+              <w:t>3 sources the model never saw</w:t>
             </w:r>
           </w:p>
         </w:tc>
         <w:tc>
           <w:tcPr>
-            <w:tcW w:type="dxa" w:w="1944"/>
+            <w:tcW w:type="dxa" w:w="1728"/>
             <w:tcBorders>
               <w:bottom w:val="single" w:sz="12" w:space="0" w:color="000000"/>
             </w:tcBorders>
@@ -592,7 +630,7 @@
             </w:pPr>
             <w:r>
               <w:rPr>
-                <w:sz w:val="18"/>
+                <w:sz w:val="19"/>
               </w:rPr>
               <w:t>68.3</w:t>
             </w:r>
@@ -612,7 +650,7 @@
             </w:pPr>
             <w:r>
               <w:rPr>
-                <w:sz w:val="18"/>
+                <w:sz w:val="19"/>
               </w:rPr>
               <w:t>70.0</w:t>
             </w:r>
@@ -620,7 +658,7 @@
         </w:tc>
         <w:tc>
           <w:tcPr>
-            <w:tcW w:type="dxa" w:w="2664"/>
+            <w:tcW w:type="dxa" w:w="2736"/>
             <w:tcBorders>
               <w:bottom w:val="single" w:sz="12" w:space="0" w:color="000000"/>
             </w:tcBorders>
@@ -632,9 +670,9 @@
             </w:pPr>
             <w:r>
               <w:rPr>
-                <w:sz w:val="18"/>
+                <w:sz w:val="19"/>
               </w:rPr>
-              <w:t>+1.7 [-1.3, +4.3], not significant</w:t>
+              <w:t>+1.7  (-1.3 to +4.3), could be chance</w:t>
             </w:r>
           </w:p>
         </w:tc>
@@ -650,7 +688,7 @@
         <w:rPr>
           <w:sz w:val="17"/>
         </w:rPr>
-        <w:t>The confirmation datasets were assembled after the comparison was finished and influenced no decision, so they are the best guide to performance on a new dataset.</w:t>
+        <w:t>The 11 datasets used for no decision were put together after the comparison was finished, so they are the best guide to how the model would do on new data.</w:t>
       </w:r>
     </w:p>
     <w:p>
@@ -662,7 +700,7 @@
       <w:r>
         <w:drawing>
           <wp:inline xmlns:a="http://schemas.openxmlformats.org/drawingml/2006/main" xmlns:pic="http://schemas.openxmlformats.org/drawingml/2006/picture">
-            <wp:extent cx="4846320" cy="2271712"/>
+            <wp:extent cx="4937760" cy="2319251"/>
             <wp:docPr id="1" name="Picture 1"/>
             <wp:cNvGraphicFramePr>
               <a:graphicFrameLocks noChangeAspect="1"/>
@@ -671,7 +709,7 @@
               <a:graphicData uri="http://schemas.openxmlformats.org/drawingml/2006/picture">
                 <pic:pic>
                   <pic:nvPicPr>
-                    <pic:cNvPr id="0" name="fig1_gain_over_baseline.png"/>
+                    <pic:cNvPr id="0" name="fig_summary.png"/>
                     <pic:cNvPicPr/>
                   </pic:nvPicPr>
                   <pic:blipFill>
@@ -683,7 +721,7 @@
                   <pic:spPr>
                     <a:xfrm>
                       <a:off x="0" y="0"/>
-                      <a:ext cx="4846320" cy="2271712"/>
+                      <a:ext cx="4937760" cy="2319251"/>
                     </a:xfrm>
                     <a:prstGeom prst="rect"/>
                   </pic:spPr>
@@ -706,7 +744,7 @@
       </w:r>
       <w:r>
         <w:rPr/>
-        <w:t xml:space="preserve"> Accuracy gain over the baseline with 95% intervals. The gain is large on datasets close to the training families and small on the confirmation datasets.</w:t>
+        <w:t xml:space="preserve"> Questions answered correctly: untouched model against fine-tuned model.</w:t>
       </w:r>
     </w:p>
     <w:p>
@@ -714,7 +752,7 @@
         <w:pStyle w:val="Heading2"/>
       </w:pPr>
       <w:r>
-        <w:t>How strong is the evidence?</w:t>
+        <w:t>What to keep in mind</w:t>
       </w:r>
     </w:p>
     <w:p>
@@ -725,9 +763,9 @@
       </w:pPr>
       <w:r>
         <w:rPr>
-          <w:sz w:val="21"/>
+          <w:sz w:val="22"/>
         </w:rPr>
-        <w:t>One base model, one laptop GPU and one training configuration; larger models or longer training could behave differently.</w:t>
+        <w:t>The study used one small model, one laptop-class graphics card and one training setup. Larger models or longer training could behave differently.</w:t>
       </w:r>
     </w:p>
     <w:p>
@@ -738,9 +776,9 @@
       </w:pPr>
       <w:r>
         <w:rPr>
-          <w:sz w:val="21"/>
+          <w:sz w:val="22"/>
         </w:rPr>
-        <w:t>Three training runs per recipe for the main comparison, but only one for some of the other techniques.</w:t>
+        <w:t>The most reliable figure is the gain of about 3 points on new data. The larger gains come from datasets that are close to the material the model was trained on.</w:t>
       </w:r>
     </w:p>
     <w:p>
@@ -751,9 +789,9 @@
       </w:pPr>
       <w:r>
         <w:rPr>
-          <w:sz w:val="21"/>
+          <w:sz w:val="22"/>
         </w:rPr>
-        <w:t>No comparison against other released decision models, which would be the most informative next experiment.</w:t>
+        <w:t>We did not compare against other published models of this kind. That would be the most useful next step.</w:t>
       </w:r>
     </w:p>
     <w:p>
@@ -764,41 +802,9 @@
       </w:pPr>
       <w:r>
         <w:rPr>
-          <w:sz w:val="21"/>
+          <w:sz w:val="22"/>
         </w:rPr>
-        <w:t>A leaderboard-style run was done only for an earlier version of the model and is unofficial; it should not be compared with published leaderboard scores.</w:t>
-      </w:r>
-    </w:p>
-    <w:p>
-      <w:pPr>
-        <w:pStyle w:val="ListBullet"/>
-        <w:spacing w:after="40"/>
-        <w:jc w:val="both"/>
-      </w:pPr>
-      <w:r>
-        <w:rPr>
-          <w:sz w:val="21"/>
-        </w:rPr>
-        <w:t>The experiments, analysis and drafts were produced with the assistance of an AI model working under the author's direction.</w:t>
-      </w:r>
-    </w:p>
-    <w:p>
-      <w:pPr>
-        <w:pStyle w:val="Heading2"/>
-      </w:pPr>
-      <w:r>
-        <w:t>Publication fit</w:t>
-      </w:r>
-    </w:p>
-    <w:p>
-      <w:pPr>
-        <w:keepNext w:val="0"/>
-      </w:pPr>
-      <w:r>
-        <w:rPr>
-          <w:sz w:val="21"/>
-        </w:rPr>
-        <w:t>The paper is an empirical study, not a new method. It is suitable for a preprint, a workshop on calibration or small models, or a journal that judges the soundness of the evidence rather than novelty. It is unlikely to be accepted at the main track of a top conference. Before submission it needs the author's own review, a spot-check of the dataset citations, the institution's plagiarism check and, ideally, an outside reader.</w:t>
+        <w:t>The experiments, analysis and drafts were produced with the help of an AI assistant (Claude) under the author's direction. The author is responsible for the content.</w:t>
       </w:r>
     </w:p>
     <w:sectPr>
@@ -846,7 +852,7 @@
         <w:i/>
         <w:sz w:val="18"/>
       </w:rPr>
-      <w:t>What does fine-tuning buy a small vision-language decision model?  |  Abstract and summary</w:t>
+      <w:t>Is fine-tuning a small AI model worth it?  |  Summary of the research paper</w:t>
     </w:r>
   </w:p>
 </w:hdr>

</xml_diff>

<commit_message>
Manager copy: keep only a simpler abstract (problems, answer head, results by option count, temperature scaling, next steps)
Co-Authored-By: Claude Sonnet 5.5 <noreply@anthropic.com>
</commit_message>
<xml_diff>
--- a/paper/manager_copy/Paper_Abstract_and_Summary.docx
+++ b/paper/manager_copy/Paper_Abstract_and_Summary.docx
@@ -55,7 +55,7 @@
         <w:pStyle w:val="Heading2"/>
       </w:pPr>
       <w:r>
-        <w:t>In short</w:t>
+        <w:t>The job</w:t>
       </w:r>
     </w:p>
     <w:p>
@@ -67,20 +67,7 @@
         <w:rPr>
           <w:sz w:val="22"/>
         </w:rPr>
-        <w:t xml:space="preserve">We took a small, publicly available AI model that can read text and pictures, and trained it further for one job: choose one answer from a fixed list and say how sure it is. Then we measured how much better it is than the same model left untouched. </w:t>
-      </w:r>
-      <w:r>
-        <w:rPr>
-          <w:b/>
-          <w:sz w:val="22"/>
-        </w:rPr>
-        <w:t>On new data it is more accurate, but the gain is smaller than it first looks</w:t>
-      </w:r>
-      <w:r>
-        <w:rPr>
-          <w:sz w:val="22"/>
-        </w:rPr>
-        <w:t>: about 3 percentage points on datasets that played no part in our decisions, compared with about 7 on the datasets we used while developing it. Much of the improvement in how well it judges its own certainty can be had for free, with a simple adjustment to the untouched model. The change that helped most was training on a wider variety of tasks. One weakness remains: when a question has more than 10 possible answers, the trained model does worse than the untouched one.</w:t>
+        <w:t>We want a small, publicly available AI model that reads text and pictures to pick one answer from a list of choices and to say how sure it is. Think of sorting a request, flagging a message or choosing a tool.</w:t>
       </w:r>
     </w:p>
     <w:p>
@@ -88,7 +75,225 @@
         <w:pStyle w:val="Heading2"/>
       </w:pPr>
       <w:r>
-        <w:t>What we wanted to find out</w:t>
+        <w:t>1. The problem with the untouched model</w:t>
+      </w:r>
+    </w:p>
+    <w:p>
+      <w:pPr>
+        <w:pStyle w:val="ListBullet"/>
+        <w:spacing w:after="40"/>
+        <w:jc w:val="both"/>
+      </w:pPr>
+      <w:r>
+        <w:rPr>
+          <w:sz w:val="22"/>
+        </w:rPr>
+        <w:t>It was not trained for this job, so it gets fewer answers right than it could.</w:t>
+      </w:r>
+    </w:p>
+    <w:p>
+      <w:pPr>
+        <w:pStyle w:val="ListBullet"/>
+        <w:spacing w:after="40"/>
+        <w:jc w:val="both"/>
+      </w:pPr>
+      <w:r>
+        <w:rPr>
+          <w:sz w:val="22"/>
+        </w:rPr>
+        <w:t xml:space="preserve">It is </w:t>
+      </w:r>
+      <w:r>
+        <w:rPr>
+          <w:b/>
+          <w:sz w:val="22"/>
+        </w:rPr>
+        <w:t>overconfident</w:t>
+      </w:r>
+      <w:r>
+        <w:rPr>
+          <w:sz w:val="22"/>
+        </w:rPr>
+        <w:t>: it says it is very sure even when it is wrong, so its stated certainty cannot be trusted.</w:t>
+      </w:r>
+    </w:p>
+    <w:p>
+      <w:pPr>
+        <w:pStyle w:val="ListBullet"/>
+        <w:spacing w:after="40"/>
+        <w:jc w:val="both"/>
+      </w:pPr>
+      <w:r>
+        <w:rPr>
+          <w:sz w:val="22"/>
+        </w:rPr>
+        <w:t>It answers by naming a letter (A, B, C ...), which leads to the next two problems.</w:t>
+      </w:r>
+    </w:p>
+    <w:p>
+      <w:pPr>
+        <w:pStyle w:val="Heading2"/>
+      </w:pPr>
+      <w:r>
+        <w:t>2. The problem with letter labels</w:t>
+      </w:r>
+    </w:p>
+    <w:p>
+      <w:pPr>
+        <w:pStyle w:val="ListBullet"/>
+        <w:spacing w:after="40"/>
+        <w:jc w:val="both"/>
+      </w:pPr>
+      <w:r>
+        <w:rPr>
+          <w:sz w:val="22"/>
+        </w:rPr>
+        <w:t xml:space="preserve">The alphabet has 26 letters, so a question with </w:t>
+      </w:r>
+      <w:r>
+        <w:rPr>
+          <w:b/>
+          <w:sz w:val="22"/>
+        </w:rPr>
+        <w:t>more than 26 choices cannot be labelled</w:t>
+      </w:r>
+      <w:r>
+        <w:rPr>
+          <w:sz w:val="22"/>
+        </w:rPr>
+        <w:t>.</w:t>
+      </w:r>
+    </w:p>
+    <w:p>
+      <w:pPr>
+        <w:pStyle w:val="ListBullet"/>
+        <w:spacing w:after="40"/>
+        <w:jc w:val="both"/>
+      </w:pPr>
+      <w:r>
+        <w:rPr>
+          <w:sz w:val="22"/>
+        </w:rPr>
+        <w:t>The model can favour certain letters or positions, so shuffling the same choices can change its answer.</w:t>
+      </w:r>
+    </w:p>
+    <w:p>
+      <w:pPr>
+        <w:pStyle w:val="ListBullet"/>
+        <w:spacing w:after="40"/>
+        <w:jc w:val="both"/>
+      </w:pPr>
+      <w:r>
+        <w:rPr>
+          <w:sz w:val="22"/>
+        </w:rPr>
+        <w:t>Training the model to answer with letters did not beat our method on accuracy, and its stated certainty was less reliable.</w:t>
+      </w:r>
+    </w:p>
+    <w:p>
+      <w:pPr>
+        <w:pStyle w:val="Heading2"/>
+      </w:pPr>
+      <w:r>
+        <w:t>3. The problem with longer labels such as "AA", "AB" or numbers</w:t>
+      </w:r>
+    </w:p>
+    <w:p>
+      <w:pPr>
+        <w:pStyle w:val="ListBullet"/>
+        <w:spacing w:after="40"/>
+        <w:jc w:val="both"/>
+      </w:pPr>
+      <w:r>
+        <w:rPr>
+          <w:sz w:val="22"/>
+        </w:rPr>
+        <w:t>The model reads one piece of text at a time, and a label like "AA" or "37" can be split into several pieces. One probability for the whole label is then no longer available.</w:t>
+      </w:r>
+    </w:p>
+    <w:p>
+      <w:pPr>
+        <w:pStyle w:val="ListBullet"/>
+        <w:spacing w:after="40"/>
+        <w:jc w:val="both"/>
+      </w:pPr>
+      <w:r>
+        <w:rPr>
+          <w:sz w:val="22"/>
+        </w:rPr>
+        <w:t>Such labels are unnatural to the model, so it is less accurate with them. We did not test them ourselves.</w:t>
+      </w:r>
+    </w:p>
+    <w:p>
+      <w:pPr>
+        <w:pStyle w:val="Heading2"/>
+      </w:pPr>
+      <w:r>
+        <w:t>4. Our solution: an answer-picking part (the "answer head")</w:t>
+      </w:r>
+    </w:p>
+    <w:p>
+      <w:pPr>
+        <w:keepNext w:val="0"/>
+        <w:spacing w:after="60"/>
+      </w:pPr>
+      <w:r>
+        <w:rPr>
+          <w:sz w:val="22"/>
+        </w:rPr>
+        <w:t xml:space="preserve">Instead of letters, we add a small part that </w:t>
+      </w:r>
+      <w:r>
+        <w:rPr>
+          <w:b/>
+          <w:sz w:val="22"/>
+        </w:rPr>
+        <w:t>reads the words of each choice</w:t>
+      </w:r>
+      <w:r>
+        <w:rPr>
+          <w:sz w:val="22"/>
+        </w:rPr>
+        <w:t xml:space="preserve"> and compares them with the question. It works in three short steps:</w:t>
+      </w:r>
+    </w:p>
+    <w:p>
+      <w:pPr>
+        <w:pStyle w:val="ListBullet"/>
+        <w:spacing w:after="40"/>
+        <w:jc w:val="both"/>
+      </w:pPr>
+      <w:r>
+        <w:rPr>
+          <w:sz w:val="22"/>
+        </w:rPr>
+        <w:t>The model reads the question, any picture and the situation, and condenses them into one summary of the question.</w:t>
+      </w:r>
+    </w:p>
+    <w:p>
+      <w:pPr>
+        <w:pStyle w:val="ListBullet"/>
+        <w:spacing w:after="40"/>
+        <w:jc w:val="both"/>
+      </w:pPr>
+      <w:r>
+        <w:rPr>
+          <w:sz w:val="22"/>
+        </w:rPr>
+        <w:t>Each choice is condensed into its own summary in the same way.</w:t>
+      </w:r>
+    </w:p>
+    <w:p>
+      <w:pPr>
+        <w:pStyle w:val="ListBullet"/>
+        <w:spacing w:after="40"/>
+        <w:jc w:val="both"/>
+      </w:pPr>
+      <w:r>
+        <w:rPr>
+          <w:sz w:val="22"/>
+        </w:rPr>
+        <w:t>The part compares the question summary with each choice summary and gives every choice a score. A higher score means a better match.</w:t>
       </w:r>
     </w:p>
     <w:p>
@@ -100,20 +305,20 @@
         <w:rPr>
           <w:sz w:val="22"/>
         </w:rPr>
-        <w:t xml:space="preserve">Systems that must pick one answer from a list, such as sorting a request, flagging a message or choosing a tool, need both a correct answer and an honest sense of how sure they are. The question was simple: </w:t>
+        <w:t xml:space="preserve">The model is also lightly adjusted so it works well with this part (about 27 million adjustable numbers, a small fraction of the model, with the picture-reading part left unchanged). Because choices are compared by their own words, </w:t>
       </w:r>
       <w:r>
         <w:rPr>
           <w:b/>
           <w:sz w:val="22"/>
         </w:rPr>
-        <w:t>after all the training work, how much better is the model than the same model left untouched, once the untouched model is given the same simple adjustment to its certainty?</w:t>
+        <w:t>no labels are needed and there is no limit of 26</w:t>
       </w:r>
       <w:r>
         <w:rPr>
           <w:sz w:val="22"/>
         </w:rPr>
-        <w:t xml:space="preserve"> Earlier comparisons usually leave that adjustment out, which makes training look better than it is.</w:t>
+        <w:t>: it handled up to 100 choices in our tests, and the design allows 255.</w:t>
       </w:r>
     </w:p>
     <w:p>
@@ -121,120 +326,7 @@
         <w:pStyle w:val="Heading2"/>
       </w:pPr>
       <w:r>
-        <w:t>What we found</w:t>
-      </w:r>
-    </w:p>
-    <w:p>
-      <w:pPr>
-        <w:pStyle w:val="ListBullet"/>
-        <w:spacing w:after="40"/>
-        <w:jc w:val="both"/>
-      </w:pPr>
-      <w:r>
-        <w:rPr>
-          <w:b/>
-          <w:sz w:val="22"/>
-        </w:rPr>
-        <w:t>It is more accurate, but by less than it first appears.</w:t>
-      </w:r>
-      <w:r>
-        <w:rPr>
-          <w:sz w:val="22"/>
-        </w:rPr>
-        <w:t xml:space="preserve"> About 7 points better on 16 datasets used while developing it, but only about 3 points better on 11 datasets used for no decision. On 3 further sources there was no clear gain.</w:t>
-      </w:r>
-    </w:p>
-    <w:p>
-      <w:pPr>
-        <w:pStyle w:val="ListBullet"/>
-        <w:spacing w:after="40"/>
-        <w:jc w:val="both"/>
-      </w:pPr>
-      <w:r>
-        <w:rPr>
-          <w:b/>
-          <w:sz w:val="22"/>
-        </w:rPr>
-        <w:t>Most of the better judgement of certainty comes for free.</w:t>
-      </w:r>
-      <w:r>
-        <w:rPr>
-          <w:sz w:val="22"/>
-        </w:rPr>
-        <w:t xml:space="preserve"> The untouched model is overconfident. A one-number correction fixes about three quarters or more of that (74% to 87%), so training deserves less of the credit.</w:t>
-      </w:r>
-    </w:p>
-    <w:p>
-      <w:pPr>
-        <w:pStyle w:val="ListBullet"/>
-        <w:spacing w:after="40"/>
-        <w:jc w:val="both"/>
-      </w:pPr>
-      <w:r>
-        <w:rPr>
-          <w:b/>
-          <w:sz w:val="22"/>
-        </w:rPr>
-        <w:t>Training on more kinds of tasks was the one change that helped every time</w:t>
-      </w:r>
-      <w:r>
-        <w:rPr>
-          <w:sz w:val="22"/>
-        </w:rPr>
-        <w:t>: between 1 and 5 points better on all five groups of test data, averaged over three separate training runs.</w:t>
-      </w:r>
-    </w:p>
-    <w:p>
-      <w:pPr>
-        <w:pStyle w:val="ListBullet"/>
-        <w:spacing w:after="40"/>
-        <w:jc w:val="both"/>
-      </w:pPr>
-      <w:r>
-        <w:rPr>
-          <w:b/>
-          <w:sz w:val="22"/>
-        </w:rPr>
-        <w:t>A special answer-picking part we added was not more accurate than the model's own simple way of choosing.</w:t>
-      </w:r>
-      <w:r>
-        <w:rPr>
-          <w:sz w:val="22"/>
-        </w:rPr>
-        <w:t xml:space="preserve"> It is better at stating how sure it is, and it is the only choice once there are more than 26 possible answers.</w:t>
-      </w:r>
-    </w:p>
-    <w:p>
-      <w:pPr>
-        <w:pStyle w:val="ListBullet"/>
-        <w:spacing w:after="40"/>
-        <w:jc w:val="both"/>
-      </w:pPr>
-      <w:r>
-        <w:rPr>
-          <w:b/>
-          <w:sz w:val="22"/>
-        </w:rPr>
-        <w:t>A weakness remains for long lists of answers.</w:t>
-      </w:r>
-      <w:r>
-        <w:rPr>
-          <w:sz w:val="22"/>
-        </w:rPr>
-        <w:t xml:space="preserve"> With more than 10 choices the trained model scores below the untouched one. Shuffling the order of the choices and averaging helps a little; adding extra training examples with many choices did not.</w:t>
-      </w:r>
-    </w:p>
-    <w:p>
-      <w:r>
-        <w:br w:type="page"/>
-      </w:r>
-    </w:p>
-    <w:p>
-      <w:pPr>
-        <w:pStyle w:val="Heading2"/>
-      </w:pPr>
-      <w:r>
-        <w:t>Results at a glance</w:t>
+        <w:t>Results by number of choices</w:t>
       </w:r>
     </w:p>
     <w:p>
@@ -250,7 +342,7 @@
       </w:r>
       <w:r>
         <w:rPr/>
-        <w:t xml:space="preserve"> Share of questions answered correctly (%). The "untouched model" has had a simple adjustment to its certainty, so the comparison is fair. The range shows how far each gain could move by chance.</w:t>
+        <w:t xml:space="preserve"> Share of questions answered correctly (%). The untouched model has had the simple confidence adjustment described below, so the comparison is fair. About 5,000 questions from 21 datasets, plus 700 questions with 27 to 100 choices.</w:t>
       </w:r>
     </w:p>
     <w:tbl>
@@ -273,7 +365,7 @@
         </w:trPr>
         <w:tc>
           <w:tcPr>
-            <w:tcW w:type="dxa" w:w="3600"/>
+            <w:tcW w:type="dxa" w:w="2304"/>
             <w:tcBorders>
               <w:top w:val="single" w:sz="12" w:space="0" w:color="000000"/>
               <w:bottom w:val="single" w:sz="6" w:space="0" w:color="000000"/>
@@ -289,13 +381,13 @@
                 <w:b/>
                 <w:sz w:val="19"/>
               </w:rPr>
-              <w:t>Test data</w:t>
+              <w:t>Number of choices</w:t>
             </w:r>
           </w:p>
         </w:tc>
         <w:tc>
           <w:tcPr>
-            <w:tcW w:type="dxa" w:w="1728"/>
+            <w:tcW w:type="dxa" w:w="2016"/>
             <w:tcBorders>
               <w:top w:val="single" w:sz="12" w:space="0" w:color="000000"/>
               <w:bottom w:val="single" w:sz="6" w:space="0" w:color="000000"/>
@@ -317,7 +409,7 @@
         </w:tc>
         <w:tc>
           <w:tcPr>
-            <w:tcW w:type="dxa" w:w="1728"/>
+            <w:tcW w:type="dxa" w:w="2016"/>
             <w:tcBorders>
               <w:top w:val="single" w:sz="12" w:space="0" w:color="000000"/>
               <w:bottom w:val="single" w:sz="6" w:space="0" w:color="000000"/>
@@ -339,7 +431,7 @@
         </w:tc>
         <w:tc>
           <w:tcPr>
-            <w:tcW w:type="dxa" w:w="2736"/>
+            <w:tcW w:type="dxa" w:w="3024"/>
             <w:tcBorders>
               <w:top w:val="single" w:sz="12" w:space="0" w:color="000000"/>
               <w:bottom w:val="single" w:sz="6" w:space="0" w:color="000000"/>
@@ -355,7 +447,7 @@
                 <w:b/>
                 <w:sz w:val="19"/>
               </w:rPr>
-              <w:t>Gain and likely range</w:t>
+              <w:t>Verdict</w:t>
             </w:r>
           </w:p>
         </w:tc>
@@ -366,7 +458,7 @@
         </w:trPr>
         <w:tc>
           <w:tcPr>
-            <w:tcW w:type="dxa" w:w="3600"/>
+            <w:tcW w:type="dxa" w:w="2304"/>
           </w:tcPr>
           <w:p>
             <w:pPr>
@@ -377,13 +469,13 @@
               <w:rPr>
                 <w:sz w:val="19"/>
               </w:rPr>
-              <w:t>16 datasets used while developing</w:t>
+              <w:t>2 (yes / no)</w:t>
             </w:r>
           </w:p>
         </w:tc>
         <w:tc>
           <w:tcPr>
-            <w:tcW w:type="dxa" w:w="1728"/>
+            <w:tcW w:type="dxa" w:w="2016"/>
           </w:tcPr>
           <w:p>
             <w:pPr>
@@ -394,13 +486,13 @@
               <w:rPr>
                 <w:sz w:val="19"/>
               </w:rPr>
-              <w:t>71.1</w:t>
+              <w:t>66.1</w:t>
             </w:r>
           </w:p>
         </w:tc>
         <w:tc>
           <w:tcPr>
-            <w:tcW w:type="dxa" w:w="1728"/>
+            <w:tcW w:type="dxa" w:w="2016"/>
           </w:tcPr>
           <w:p>
             <w:pPr>
@@ -411,13 +503,13 @@
               <w:rPr>
                 <w:sz w:val="19"/>
               </w:rPr>
-              <w:t>78.0</w:t>
+              <w:t>77.4</w:t>
             </w:r>
           </w:p>
         </w:tc>
         <w:tc>
           <w:tcPr>
-            <w:tcW w:type="dxa" w:w="2736"/>
+            <w:tcW w:type="dxa" w:w="3024"/>
           </w:tcPr>
           <w:p>
             <w:pPr>
@@ -428,7 +520,7 @@
               <w:rPr>
                 <w:sz w:val="19"/>
               </w:rPr>
-              <w:t>+6.9  (+5.5 to +8.3)</w:t>
+              <w:t>Better by 11 points</w:t>
             </w:r>
           </w:p>
         </w:tc>
@@ -439,7 +531,7 @@
         </w:trPr>
         <w:tc>
           <w:tcPr>
-            <w:tcW w:type="dxa" w:w="3600"/>
+            <w:tcW w:type="dxa" w:w="2304"/>
           </w:tcPr>
           <w:p>
             <w:pPr>
@@ -450,13 +542,13 @@
               <w:rPr>
                 <w:sz w:val="19"/>
               </w:rPr>
-              <w:t>11 datasets used for no decision</w:t>
+              <w:t>3 to 4</w:t>
             </w:r>
           </w:p>
         </w:tc>
         <w:tc>
           <w:tcPr>
-            <w:tcW w:type="dxa" w:w="1728"/>
+            <w:tcW w:type="dxa" w:w="2016"/>
           </w:tcPr>
           <w:p>
             <w:pPr>
@@ -467,13 +559,13 @@
               <w:rPr>
                 <w:sz w:val="19"/>
               </w:rPr>
-              <w:t>69.2</w:t>
+              <w:t>72.6</w:t>
             </w:r>
           </w:p>
         </w:tc>
         <w:tc>
           <w:tcPr>
-            <w:tcW w:type="dxa" w:w="1728"/>
+            <w:tcW w:type="dxa" w:w="2016"/>
           </w:tcPr>
           <w:p>
             <w:pPr>
@@ -484,13 +576,13 @@
               <w:rPr>
                 <w:sz w:val="19"/>
               </w:rPr>
-              <w:t>72.0</w:t>
+              <w:t>82.2</w:t>
             </w:r>
           </w:p>
         </w:tc>
         <w:tc>
           <w:tcPr>
-            <w:tcW w:type="dxa" w:w="2736"/>
+            <w:tcW w:type="dxa" w:w="3024"/>
           </w:tcPr>
           <w:p>
             <w:pPr>
@@ -501,7 +593,7 @@
               <w:rPr>
                 <w:sz w:val="19"/>
               </w:rPr>
-              <w:t>+2.8  (+1.2 to +4.4)</w:t>
+              <w:t>Better by 10 points</w:t>
             </w:r>
           </w:p>
         </w:tc>
@@ -512,7 +604,7 @@
         </w:trPr>
         <w:tc>
           <w:tcPr>
-            <w:tcW w:type="dxa" w:w="3600"/>
+            <w:tcW w:type="dxa" w:w="2304"/>
           </w:tcPr>
           <w:p>
             <w:pPr>
@@ -523,13 +615,13 @@
               <w:rPr>
                 <w:sz w:val="19"/>
               </w:rPr>
-              <w:t>2 more development datasets</w:t>
+              <w:t>5 to 10</w:t>
             </w:r>
           </w:p>
         </w:tc>
         <w:tc>
           <w:tcPr>
-            <w:tcW w:type="dxa" w:w="1728"/>
+            <w:tcW w:type="dxa" w:w="2016"/>
           </w:tcPr>
           <w:p>
             <w:pPr>
@@ -540,13 +632,13 @@
               <w:rPr>
                 <w:sz w:val="19"/>
               </w:rPr>
-              <w:t>61.2</w:t>
+              <w:t>74.7</w:t>
             </w:r>
           </w:p>
         </w:tc>
         <w:tc>
           <w:tcPr>
-            <w:tcW w:type="dxa" w:w="1728"/>
+            <w:tcW w:type="dxa" w:w="2016"/>
           </w:tcPr>
           <w:p>
             <w:pPr>
@@ -557,13 +649,13 @@
               <w:rPr>
                 <w:sz w:val="19"/>
               </w:rPr>
-              <w:t>76.2</w:t>
+              <w:t>76.4</w:t>
             </w:r>
           </w:p>
         </w:tc>
         <w:tc>
           <w:tcPr>
-            <w:tcW w:type="dxa" w:w="2736"/>
+            <w:tcW w:type="dxa" w:w="3024"/>
           </w:tcPr>
           <w:p>
             <w:pPr>
@@ -574,7 +666,7 @@
               <w:rPr>
                 <w:sz w:val="19"/>
               </w:rPr>
-              <w:t>+15.0  (+11.2 to +18.8)</w:t>
+              <w:t>Slightly better</w:t>
             </w:r>
           </w:p>
         </w:tc>
@@ -585,7 +677,81 @@
         </w:trPr>
         <w:tc>
           <w:tcPr>
-            <w:tcW w:type="dxa" w:w="3600"/>
+            <w:tcW w:type="dxa" w:w="2304"/>
+          </w:tcPr>
+          <w:p>
+            <w:pPr>
+              <w:spacing w:after="20" w:before="20" w:line="240" w:lineRule="auto"/>
+              <w:jc w:val="left"/>
+            </w:pPr>
+            <w:r>
+              <w:rPr>
+                <w:sz w:val="19"/>
+              </w:rPr>
+              <w:t>11 to 26</w:t>
+            </w:r>
+          </w:p>
+        </w:tc>
+        <w:tc>
+          <w:tcPr>
+            <w:tcW w:type="dxa" w:w="2016"/>
+          </w:tcPr>
+          <w:p>
+            <w:pPr>
+              <w:spacing w:after="20" w:before="20" w:line="240" w:lineRule="auto"/>
+              <w:jc w:val="center"/>
+            </w:pPr>
+            <w:r>
+              <w:rPr>
+                <w:sz w:val="19"/>
+              </w:rPr>
+              <w:t>58.7</w:t>
+            </w:r>
+          </w:p>
+        </w:tc>
+        <w:tc>
+          <w:tcPr>
+            <w:tcW w:type="dxa" w:w="2016"/>
+          </w:tcPr>
+          <w:p>
+            <w:pPr>
+              <w:spacing w:after="20" w:before="20" w:line="240" w:lineRule="auto"/>
+              <w:jc w:val="center"/>
+            </w:pPr>
+            <w:r>
+              <w:rPr>
+                <w:sz w:val="19"/>
+              </w:rPr>
+              <w:t>54.2</w:t>
+            </w:r>
+          </w:p>
+        </w:tc>
+        <w:tc>
+          <w:tcPr>
+            <w:tcW w:type="dxa" w:w="3024"/>
+          </w:tcPr>
+          <w:p>
+            <w:pPr>
+              <w:spacing w:after="20" w:before="20" w:line="240" w:lineRule="auto"/>
+              <w:jc w:val="center"/>
+            </w:pPr>
+            <w:r>
+              <w:rPr>
+                <w:b/>
+                <w:sz w:val="19"/>
+              </w:rPr>
+              <w:t>Worse by 4 points</w:t>
+            </w:r>
+          </w:p>
+        </w:tc>
+      </w:tr>
+      <w:tr>
+        <w:trPr>
+          <w:cantSplit/>
+        </w:trPr>
+        <w:tc>
+          <w:tcPr>
+            <w:tcW w:type="dxa" w:w="2304"/>
             <w:tcBorders>
               <w:bottom w:val="single" w:sz="12" w:space="0" w:color="000000"/>
             </w:tcBorders>
@@ -599,13 +765,13 @@
               <w:rPr>
                 <w:sz w:val="19"/>
               </w:rPr>
-              <w:t>3 sources the model never saw</w:t>
+              <w:t>27 to 100</w:t>
             </w:r>
           </w:p>
         </w:tc>
         <w:tc>
           <w:tcPr>
-            <w:tcW w:type="dxa" w:w="1728"/>
+            <w:tcW w:type="dxa" w:w="2016"/>
             <w:tcBorders>
               <w:bottom w:val="single" w:sz="12" w:space="0" w:color="000000"/>
             </w:tcBorders>
@@ -619,13 +785,13 @@
               <w:rPr>
                 <w:sz w:val="19"/>
               </w:rPr>
-              <w:t>68.3</w:t>
+              <w:t>cannot answer</w:t>
             </w:r>
           </w:p>
         </w:tc>
         <w:tc>
           <w:tcPr>
-            <w:tcW w:type="dxa" w:w="1728"/>
+            <w:tcW w:type="dxa" w:w="2016"/>
             <w:tcBorders>
               <w:bottom w:val="single" w:sz="12" w:space="0" w:color="000000"/>
             </w:tcBorders>
@@ -639,13 +805,13 @@
               <w:rPr>
                 <w:sz w:val="19"/>
               </w:rPr>
-              <w:t>70.0</w:t>
+              <w:t>48.4</w:t>
             </w:r>
           </w:p>
         </w:tc>
         <w:tc>
           <w:tcPr>
-            <w:tcW w:type="dxa" w:w="2736"/>
+            <w:tcW w:type="dxa" w:w="3024"/>
             <w:tcBorders>
               <w:bottom w:val="single" w:sz="12" w:space="0" w:color="000000"/>
             </w:tcBorders>
@@ -659,7 +825,7 @@
               <w:rPr>
                 <w:sz w:val="19"/>
               </w:rPr>
-              <w:t>+1.7  (-1.3 to +4.3), could be chance</w:t>
+              <w:t>Only option that works</w:t>
             </w:r>
           </w:p>
         </w:tc>
@@ -675,7 +841,7 @@
         <w:rPr>
           <w:sz w:val="17"/>
         </w:rPr>
-        <w:t>The 11 datasets used for no decision were put together after the comparison was finished, so they are the best guide to how the model would do on new data.</w:t>
+        <w:t>Shuffling the order of the choices and averaging over four orders lifts the 11 to 26 result to 56.9, which is still below the untouched model.</w:t>
       </w:r>
     </w:p>
     <w:p>
@@ -687,7 +853,7 @@
       <w:r>
         <w:drawing>
           <wp:inline xmlns:a="http://schemas.openxmlformats.org/drawingml/2006/main" xmlns:pic="http://schemas.openxmlformats.org/drawingml/2006/picture">
-            <wp:extent cx="4937760" cy="2319251"/>
+            <wp:extent cx="4937760" cy="2394065"/>
             <wp:docPr id="1" name="Picture 1"/>
             <wp:cNvGraphicFramePr>
               <a:graphicFrameLocks noChangeAspect="1"/>
@@ -696,7 +862,7 @@
               <a:graphicData uri="http://schemas.openxmlformats.org/drawingml/2006/picture">
                 <pic:pic>
                   <pic:nvPicPr>
-                    <pic:cNvPr id="0" name="fig_summary.png"/>
+                    <pic:cNvPr id="0" name="fig_options.png"/>
                     <pic:cNvPicPr/>
                   </pic:nvPicPr>
                   <pic:blipFill>
@@ -708,7 +874,7 @@
                   <pic:spPr>
                     <a:xfrm>
                       <a:off x="0" y="0"/>
-                      <a:ext cx="4937760" cy="2319251"/>
+                      <a:ext cx="4937760" cy="2394065"/>
                     </a:xfrm>
                     <a:prstGeom prst="rect"/>
                   </pic:spPr>
@@ -731,7 +897,24 @@
       </w:r>
       <w:r>
         <w:rPr/>
-        <w:t xml:space="preserve"> Questions answered correctly: untouched model against fine-tuned model.</w:t>
+        <w:t xml:space="preserve"> Questions answered correctly, by number of choices.</w:t>
+      </w:r>
+    </w:p>
+    <w:p>
+      <w:pPr>
+        <w:keepNext w:val="0"/>
+        <w:spacing w:after="80"/>
+      </w:pPr>
+      <w:r>
+        <w:rPr>
+          <w:sz w:val="22"/>
+        </w:rPr>
+        <w:t>In short: the fine-tuned model is clearly better for 2 to 4 choices, slightly better for 5 to 10, worse for 11 to 26, and the only one that works beyond 26. Over 16 datasets used while developing the model it was about 7 points more accurate, and over 11 datasets set aside for the final check, about 3 points.</w:t>
+      </w:r>
+    </w:p>
+    <w:p>
+      <w:r>
+        <w:br w:type="page"/>
       </w:r>
     </w:p>
     <w:p>
@@ -739,7 +922,46 @@
         <w:pStyle w:val="Heading2"/>
       </w:pPr>
       <w:r>
-        <w:t>What to keep in mind</w:t>
+        <w:t>5. Making the stated certainty trustworthy: temperature scaling</w:t>
+      </w:r>
+    </w:p>
+    <w:p>
+      <w:pPr>
+        <w:keepNext w:val="0"/>
+        <w:spacing w:after="60"/>
+      </w:pPr>
+      <w:r>
+        <w:rPr>
+          <w:sz w:val="22"/>
+        </w:rPr>
+        <w:t xml:space="preserve">After training, the model's certainty is still a little off. We fix this with one number, the temperature </w:t>
+      </w:r>
+      <w:r>
+        <w:rPr>
+          <w:b/>
+          <w:sz w:val="22"/>
+        </w:rPr>
+        <w:t>T</w:t>
+      </w:r>
+      <w:r>
+        <w:rPr>
+          <w:sz w:val="22"/>
+        </w:rPr>
+        <w:t>, found by trying values on a set of questions kept aside and keeping the one that gives the most honest probabilities. The score of each choice is divided by T before it is turned into a probability:</w:t>
+      </w:r>
+    </w:p>
+    <w:p>
+      <w:pPr>
+        <w:keepNext w:val="0"/>
+        <w:spacing w:after="60"/>
+        <w:jc w:val="center"/>
+      </w:pPr>
+      <w:r>
+        <w:rPr>
+          <w:b/>
+          <w:sz w:val="22"/>
+        </w:rPr>
+        <w:t>Probability of choice j  =  e^(score_j / T)  divided by  the sum of e^(score_k / T) over all choices k</w:t>
       </w:r>
     </w:p>
     <w:p>
@@ -752,7 +974,7 @@
         <w:rPr>
           <w:sz w:val="22"/>
         </w:rPr>
-        <w:t>The study used one small model, one laptop-class graphics card and one training setup. Larger models or longer training could behave differently.</w:t>
+        <w:t>T above 1 makes the model less sure of itself; T below 1 makes it more sure.</w:t>
       </w:r>
     </w:p>
     <w:p>
@@ -765,7 +987,20 @@
         <w:rPr>
           <w:sz w:val="22"/>
         </w:rPr>
-        <w:t>The most reliable figure is the gain of about 3 points on new data. The larger gains come from datasets that are close to the material the model was trained on.</w:t>
+        <w:t xml:space="preserve">Dividing every score by the same T never changes which choice wins, so </w:t>
+      </w:r>
+      <w:r>
+        <w:rPr>
+          <w:b/>
+          <w:sz w:val="22"/>
+        </w:rPr>
+        <w:t>accuracy stays the same</w:t>
+      </w:r>
+      <w:r>
+        <w:rPr>
+          <w:sz w:val="22"/>
+        </w:rPr>
+        <w:t xml:space="preserve"> and only the honesty of the stated certainty improves.</w:t>
       </w:r>
     </w:p>
     <w:p>
@@ -778,7 +1013,362 @@
         <w:rPr>
           <w:sz w:val="22"/>
         </w:rPr>
-        <w:t>We did not compare against other published models of this kind. That would be the most useful next step.</w:t>
+        <w:t>The untouched model needs a large T (about 4 to 7) because it is so overconfident. Our model needs only a small one (0.7 to 1.3).</w:t>
+      </w:r>
+    </w:p>
+    <w:p>
+      <w:pPr>
+        <w:pStyle w:val="Caption"/>
+        <w:keepNext/>
+      </w:pPr>
+      <w:r>
+        <w:rPr>
+          <w:b/>
+        </w:rPr>
+        <w:t>Table 2.</w:t>
+      </w:r>
+      <w:r>
+        <w:rPr/>
+        <w:t xml:space="preserve"> Error between stated certainty and actual accuracy (lower is better), on the 16 development datasets.</w:t>
+      </w:r>
+    </w:p>
+    <w:tbl>
+      <w:tblPr>
+        <w:tblW w:type="auto" w:w="0"/>
+        <w:jc w:val="center"/>
+        <w:tblLayout w:type="fixed"/>
+        <w:tblLook w:firstColumn="1" w:firstRow="1" w:lastColumn="0" w:lastRow="0" w:noHBand="0" w:noVBand="1" w:val="04A0"/>
+      </w:tblPr>
+      <w:tblGrid>
+        <w:gridCol w:w="2340"/>
+        <w:gridCol w:w="2340"/>
+        <w:gridCol w:w="2340"/>
+        <w:gridCol w:w="2340"/>
+      </w:tblGrid>
+      <w:tr>
+        <w:trPr>
+          <w:cantSplit/>
+          <w:tblHeader/>
+        </w:trPr>
+        <w:tc>
+          <w:tcPr>
+            <w:tcW w:type="dxa" w:w="2160"/>
+            <w:tcBorders>
+              <w:top w:val="single" w:sz="12" w:space="0" w:color="000000"/>
+              <w:bottom w:val="single" w:sz="6" w:space="0" w:color="000000"/>
+            </w:tcBorders>
+          </w:tcPr>
+          <w:p>
+            <w:pPr>
+              <w:spacing w:after="20" w:before="20" w:line="240" w:lineRule="auto"/>
+              <w:jc w:val="left"/>
+            </w:pPr>
+          </w:p>
+        </w:tc>
+        <w:tc>
+          <w:tcPr>
+            <w:tcW w:type="dxa" w:w="2160"/>
+            <w:tcBorders>
+              <w:top w:val="single" w:sz="12" w:space="0" w:color="000000"/>
+              <w:bottom w:val="single" w:sz="6" w:space="0" w:color="000000"/>
+            </w:tcBorders>
+          </w:tcPr>
+          <w:p>
+            <w:pPr>
+              <w:spacing w:after="20" w:before="20" w:line="240" w:lineRule="auto"/>
+              <w:jc w:val="center"/>
+            </w:pPr>
+            <w:r>
+              <w:rPr>
+                <w:b/>
+                <w:sz w:val="19"/>
+              </w:rPr>
+              <w:t>Untouched model</w:t>
+            </w:r>
+          </w:p>
+        </w:tc>
+        <w:tc>
+          <w:tcPr>
+            <w:tcW w:type="dxa" w:w="2592"/>
+            <w:tcBorders>
+              <w:top w:val="single" w:sz="12" w:space="0" w:color="000000"/>
+              <w:bottom w:val="single" w:sz="6" w:space="0" w:color="000000"/>
+            </w:tcBorders>
+          </w:tcPr>
+          <w:p>
+            <w:pPr>
+              <w:spacing w:after="20" w:before="20" w:line="240" w:lineRule="auto"/>
+              <w:jc w:val="center"/>
+            </w:pPr>
+            <w:r>
+              <w:rPr>
+                <w:b/>
+                <w:sz w:val="19"/>
+              </w:rPr>
+              <w:t>Untouched model + temperature</w:t>
+            </w:r>
+          </w:p>
+        </w:tc>
+        <w:tc>
+          <w:tcPr>
+            <w:tcW w:type="dxa" w:w="2592"/>
+            <w:tcBorders>
+              <w:top w:val="single" w:sz="12" w:space="0" w:color="000000"/>
+              <w:bottom w:val="single" w:sz="6" w:space="0" w:color="000000"/>
+            </w:tcBorders>
+          </w:tcPr>
+          <w:p>
+            <w:pPr>
+              <w:spacing w:after="20" w:before="20" w:line="240" w:lineRule="auto"/>
+              <w:jc w:val="center"/>
+            </w:pPr>
+            <w:r>
+              <w:rPr>
+                <w:b/>
+                <w:sz w:val="19"/>
+              </w:rPr>
+              <w:t>Fine-tuned model + temperature</w:t>
+            </w:r>
+          </w:p>
+        </w:tc>
+      </w:tr>
+      <w:tr>
+        <w:trPr>
+          <w:cantSplit/>
+        </w:trPr>
+        <w:tc>
+          <w:tcPr>
+            <w:tcW w:type="dxa" w:w="2160"/>
+            <w:tcBorders>
+              <w:bottom w:val="single" w:sz="12" w:space="0" w:color="000000"/>
+            </w:tcBorders>
+          </w:tcPr>
+          <w:p>
+            <w:pPr>
+              <w:spacing w:after="20" w:before="20" w:line="240" w:lineRule="auto"/>
+              <w:jc w:val="left"/>
+            </w:pPr>
+            <w:r>
+              <w:rPr>
+                <w:sz w:val="19"/>
+              </w:rPr>
+              <w:t>Certainty error</w:t>
+            </w:r>
+          </w:p>
+        </w:tc>
+        <w:tc>
+          <w:tcPr>
+            <w:tcW w:type="dxa" w:w="2160"/>
+            <w:tcBorders>
+              <w:bottom w:val="single" w:sz="12" w:space="0" w:color="000000"/>
+            </w:tcBorders>
+          </w:tcPr>
+          <w:p>
+            <w:pPr>
+              <w:spacing w:after="20" w:before="20" w:line="240" w:lineRule="auto"/>
+              <w:jc w:val="center"/>
+            </w:pPr>
+            <w:r>
+              <w:rPr>
+                <w:sz w:val="19"/>
+              </w:rPr>
+              <w:t>0.240</w:t>
+            </w:r>
+          </w:p>
+        </w:tc>
+        <w:tc>
+          <w:tcPr>
+            <w:tcW w:type="dxa" w:w="2592"/>
+            <w:tcBorders>
+              <w:bottom w:val="single" w:sz="12" w:space="0" w:color="000000"/>
+            </w:tcBorders>
+          </w:tcPr>
+          <w:p>
+            <w:pPr>
+              <w:spacing w:after="20" w:before="20" w:line="240" w:lineRule="auto"/>
+              <w:jc w:val="center"/>
+            </w:pPr>
+            <w:r>
+              <w:rPr>
+                <w:sz w:val="19"/>
+              </w:rPr>
+              <w:t>0.068</w:t>
+            </w:r>
+          </w:p>
+        </w:tc>
+        <w:tc>
+          <w:tcPr>
+            <w:tcW w:type="dxa" w:w="2592"/>
+            <w:tcBorders>
+              <w:bottom w:val="single" w:sz="12" w:space="0" w:color="000000"/>
+            </w:tcBorders>
+          </w:tcPr>
+          <w:p>
+            <w:pPr>
+              <w:spacing w:after="20" w:before="20" w:line="240" w:lineRule="auto"/>
+              <w:jc w:val="center"/>
+            </w:pPr>
+            <w:r>
+              <w:rPr>
+                <w:sz w:val="19"/>
+              </w:rPr>
+              <w:t>0.043</w:t>
+            </w:r>
+          </w:p>
+        </w:tc>
+      </w:tr>
+    </w:tbl>
+    <w:p>
+      <w:pPr>
+        <w:keepNext w:val="0"/>
+        <w:spacing w:after="160" w:before="40"/>
+        <w:jc w:val="both"/>
+      </w:pPr>
+      <w:r>
+        <w:rPr>
+          <w:sz w:val="17"/>
+        </w:rPr>
+        <w:t>The simple temperature fix alone removes most of the untouched model's overconfidence. Training adds a smaller improvement on top.</w:t>
+      </w:r>
+    </w:p>
+    <w:p>
+      <w:pPr>
+        <w:pStyle w:val="Heading2"/>
+      </w:pPr>
+      <w:r>
+        <w:t>6. Next steps to improve the 11 to 26 choice case</w:t>
+      </w:r>
+    </w:p>
+    <w:p>
+      <w:pPr>
+        <w:keepNext w:val="0"/>
+        <w:spacing w:after="60"/>
+      </w:pPr>
+      <w:r>
+        <w:rPr>
+          <w:sz w:val="22"/>
+        </w:rPr>
+        <w:t>These are ideas that have not been tested yet. One attempt, adding more training examples with long lists, did not help, so the first step is to find out why the model struggles here.</w:t>
+      </w:r>
+    </w:p>
+    <w:p>
+      <w:pPr>
+        <w:pStyle w:val="ListBullet"/>
+        <w:spacing w:after="40"/>
+        <w:jc w:val="both"/>
+      </w:pPr>
+      <w:r>
+        <w:rPr>
+          <w:b/>
+          <w:sz w:val="22"/>
+        </w:rPr>
+        <w:t>Find the cause first.</w:t>
+      </w:r>
+      <w:r>
+        <w:rPr>
+          <w:sz w:val="22"/>
+        </w:rPr>
+        <w:t xml:space="preserve"> Check whether the model is biased toward certain positions in a long list, or confuses choices that look alike.</w:t>
+      </w:r>
+    </w:p>
+    <w:p>
+      <w:pPr>
+        <w:pStyle w:val="ListBullet"/>
+        <w:spacing w:after="40"/>
+        <w:jc w:val="both"/>
+      </w:pPr>
+      <w:r>
+        <w:rPr>
+          <w:b/>
+          <w:sz w:val="22"/>
+        </w:rPr>
+        <w:t>More varied long-list training.</w:t>
+      </w:r>
+      <w:r>
+        <w:rPr>
+          <w:sz w:val="22"/>
+        </w:rPr>
+        <w:t xml:space="preserve"> Add many more questions with 11 to 26 choices from many different kinds of tasks, not only longer lists.</w:t>
+      </w:r>
+    </w:p>
+    <w:p>
+      <w:pPr>
+        <w:pStyle w:val="ListBullet"/>
+        <w:spacing w:after="40"/>
+        <w:jc w:val="both"/>
+      </w:pPr>
+      <w:r>
+        <w:rPr>
+          <w:b/>
+          <w:sz w:val="22"/>
+        </w:rPr>
+        <w:t>Train it to ignore the order of choices.</w:t>
+      </w:r>
+      <w:r>
+        <w:rPr>
+          <w:sz w:val="22"/>
+        </w:rPr>
+        <w:t xml:space="preserve"> Shuffle the choices more during training and penalise answers that change when the order changes.</w:t>
+      </w:r>
+    </w:p>
+    <w:p>
+      <w:pPr>
+        <w:pStyle w:val="ListBullet"/>
+        <w:spacing w:after="40"/>
+        <w:jc w:val="both"/>
+      </w:pPr>
+      <w:r>
+        <w:rPr>
+          <w:b/>
+          <w:sz w:val="22"/>
+        </w:rPr>
+        <w:t>Answer in two steps.</w:t>
+      </w:r>
+      <w:r>
+        <w:rPr>
+          <w:sz w:val="22"/>
+        </w:rPr>
+        <w:t xml:space="preserve"> First narrow a long list to a few likely choices, then pick among them.</w:t>
+      </w:r>
+    </w:p>
+    <w:p>
+      <w:pPr>
+        <w:pStyle w:val="ListBullet"/>
+        <w:spacing w:after="40"/>
+        <w:jc w:val="both"/>
+      </w:pPr>
+      <w:r>
+        <w:rPr>
+          <w:b/>
+          <w:sz w:val="22"/>
+        </w:rPr>
+        <w:t>Average over several orders when answering.</w:t>
+      </w:r>
+      <w:r>
+        <w:rPr>
+          <w:sz w:val="22"/>
+        </w:rPr>
+        <w:t xml:space="preserve"> This already helps a little (54.2 to 56.9) but costs more time.</w:t>
+      </w:r>
+    </w:p>
+    <w:p>
+      <w:pPr>
+        <w:pStyle w:val="ListBullet"/>
+        <w:spacing w:after="40"/>
+        <w:jc w:val="both"/>
+      </w:pPr>
+      <w:r>
+        <w:rPr>
+          <w:b/>
+          <w:sz w:val="22"/>
+        </w:rPr>
+        <w:t>Try a larger model or longer training</w:t>
+      </w:r>
+      <w:r>
+        <w:rPr>
+          <w:sz w:val="22"/>
+        </w:rPr>
+        <w:t>, which may handle long lists better.</w:t>
       </w:r>
     </w:p>
     <w:sectPr>

</xml_diff>

<commit_message>
Manager abstract: add results on unseen datasets and the calibration graph
Co-Authored-By: Claude Sonnet 5.5 <noreply@anthropic.com>
</commit_message>
<xml_diff>
--- a/paper/manager_copy/Paper_Abstract_and_Summary.docx
+++ b/paper/manager_copy/Paper_Abstract_and_Summary.docx
@@ -913,8 +913,485 @@
       </w:r>
     </w:p>
     <w:p>
+      <w:pPr>
+        <w:pStyle w:val="Heading2"/>
+      </w:pPr>
       <w:r>
-        <w:br w:type="page"/>
+        <w:t>Results on datasets the model had not seen</w:t>
+      </w:r>
+    </w:p>
+    <w:p>
+      <w:pPr>
+        <w:keepNext w:val="0"/>
+        <w:spacing w:after="60"/>
+      </w:pPr>
+      <w:r>
+        <w:rPr>
+          <w:sz w:val="22"/>
+        </w:rPr>
+        <w:t>The most trustworthy test uses data that played no part in building the model: 11 datasets assembled after all design decisions were made, and 3 sources whose type of task the model was never trained on (14 datasets, 3,026 questions, all with 26 or fewer choices).</w:t>
+      </w:r>
+    </w:p>
+    <w:p>
+      <w:pPr>
+        <w:pStyle w:val="Caption"/>
+        <w:keepNext/>
+      </w:pPr>
+      <w:r>
+        <w:rPr>
+          <w:b/>
+        </w:rPr>
+        <w:t>Table 2.</w:t>
+      </w:r>
+      <w:r>
+        <w:rPr/>
+        <w:t xml:space="preserve"> Questions answered correctly (%) and error between stated certainty and actual accuracy (lower is better). The range in brackets is how far the gain could move by chance.</w:t>
+      </w:r>
+    </w:p>
+    <w:tbl>
+      <w:tblPr>
+        <w:tblW w:type="auto" w:w="0"/>
+        <w:jc w:val="center"/>
+        <w:tblLayout w:type="fixed"/>
+        <w:tblLook w:firstColumn="1" w:firstRow="1" w:lastColumn="0" w:lastRow="0" w:noHBand="0" w:noVBand="1" w:val="04A0"/>
+      </w:tblPr>
+      <w:tblGrid>
+        <w:gridCol w:w="1872"/>
+        <w:gridCol w:w="1872"/>
+        <w:gridCol w:w="1872"/>
+        <w:gridCol w:w="1872"/>
+        <w:gridCol w:w="1872"/>
+      </w:tblGrid>
+      <w:tr>
+        <w:trPr>
+          <w:cantSplit/>
+          <w:tblHeader/>
+        </w:trPr>
+        <w:tc>
+          <w:tcPr>
+            <w:tcW w:type="dxa" w:w="3024"/>
+            <w:tcBorders>
+              <w:top w:val="single" w:sz="12" w:space="0" w:color="000000"/>
+              <w:bottom w:val="single" w:sz="6" w:space="0" w:color="000000"/>
+            </w:tcBorders>
+          </w:tcPr>
+          <w:p>
+            <w:pPr>
+              <w:spacing w:after="20" w:before="20" w:line="240" w:lineRule="auto"/>
+              <w:jc w:val="left"/>
+            </w:pPr>
+            <w:r>
+              <w:rPr>
+                <w:b/>
+                <w:sz w:val="18"/>
+              </w:rPr>
+              <w:t>Unseen data</w:t>
+            </w:r>
+          </w:p>
+        </w:tc>
+        <w:tc>
+          <w:tcPr>
+            <w:tcW w:type="dxa" w:w="1368"/>
+            <w:tcBorders>
+              <w:top w:val="single" w:sz="12" w:space="0" w:color="000000"/>
+              <w:bottom w:val="single" w:sz="6" w:space="0" w:color="000000"/>
+            </w:tcBorders>
+          </w:tcPr>
+          <w:p>
+            <w:pPr>
+              <w:spacing w:after="20" w:before="20" w:line="240" w:lineRule="auto"/>
+              <w:jc w:val="center"/>
+            </w:pPr>
+            <w:r>
+              <w:rPr>
+                <w:b/>
+                <w:sz w:val="18"/>
+              </w:rPr>
+              <w:t>Untouched model</w:t>
+            </w:r>
+          </w:p>
+        </w:tc>
+        <w:tc>
+          <w:tcPr>
+            <w:tcW w:type="dxa" w:w="1368"/>
+            <w:tcBorders>
+              <w:top w:val="single" w:sz="12" w:space="0" w:color="000000"/>
+              <w:bottom w:val="single" w:sz="6" w:space="0" w:color="000000"/>
+            </w:tcBorders>
+          </w:tcPr>
+          <w:p>
+            <w:pPr>
+              <w:spacing w:after="20" w:before="20" w:line="240" w:lineRule="auto"/>
+              <w:jc w:val="center"/>
+            </w:pPr>
+            <w:r>
+              <w:rPr>
+                <w:b/>
+                <w:sz w:val="18"/>
+              </w:rPr>
+              <w:t>Fine-tuned model</w:t>
+            </w:r>
+          </w:p>
+        </w:tc>
+        <w:tc>
+          <w:tcPr>
+            <w:tcW w:type="dxa" w:w="2304"/>
+            <w:tcBorders>
+              <w:top w:val="single" w:sz="12" w:space="0" w:color="000000"/>
+              <w:bottom w:val="single" w:sz="6" w:space="0" w:color="000000"/>
+            </w:tcBorders>
+          </w:tcPr>
+          <w:p>
+            <w:pPr>
+              <w:spacing w:after="20" w:before="20" w:line="240" w:lineRule="auto"/>
+              <w:jc w:val="center"/>
+            </w:pPr>
+            <w:r>
+              <w:rPr>
+                <w:b/>
+                <w:sz w:val="18"/>
+              </w:rPr>
+              <w:t>Gain (range)</w:t>
+            </w:r>
+          </w:p>
+        </w:tc>
+        <w:tc>
+          <w:tcPr>
+            <w:tcW w:type="dxa" w:w="2160"/>
+            <w:tcBorders>
+              <w:top w:val="single" w:sz="12" w:space="0" w:color="000000"/>
+              <w:bottom w:val="single" w:sz="6" w:space="0" w:color="000000"/>
+            </w:tcBorders>
+          </w:tcPr>
+          <w:p>
+            <w:pPr>
+              <w:spacing w:after="20" w:before="20" w:line="240" w:lineRule="auto"/>
+              <w:jc w:val="center"/>
+            </w:pPr>
+            <w:r>
+              <w:rPr>
+                <w:b/>
+                <w:sz w:val="18"/>
+              </w:rPr>
+              <w:t>Certainty error: untouched, then fine-tuned</w:t>
+            </w:r>
+          </w:p>
+        </w:tc>
+      </w:tr>
+      <w:tr>
+        <w:trPr>
+          <w:cantSplit/>
+        </w:trPr>
+        <w:tc>
+          <w:tcPr>
+            <w:tcW w:type="dxa" w:w="3024"/>
+          </w:tcPr>
+          <w:p>
+            <w:pPr>
+              <w:spacing w:after="20" w:before="20" w:line="240" w:lineRule="auto"/>
+              <w:jc w:val="left"/>
+            </w:pPr>
+            <w:r>
+              <w:rPr>
+                <w:sz w:val="18"/>
+              </w:rPr>
+              <w:t>11 datasets set up after the comparison</w:t>
+            </w:r>
+          </w:p>
+        </w:tc>
+        <w:tc>
+          <w:tcPr>
+            <w:tcW w:type="dxa" w:w="1368"/>
+          </w:tcPr>
+          <w:p>
+            <w:pPr>
+              <w:spacing w:after="20" w:before="20" w:line="240" w:lineRule="auto"/>
+              <w:jc w:val="center"/>
+            </w:pPr>
+            <w:r>
+              <w:rPr>
+                <w:sz w:val="18"/>
+              </w:rPr>
+              <w:t>69.2</w:t>
+            </w:r>
+          </w:p>
+        </w:tc>
+        <w:tc>
+          <w:tcPr>
+            <w:tcW w:type="dxa" w:w="1368"/>
+          </w:tcPr>
+          <w:p>
+            <w:pPr>
+              <w:spacing w:after="20" w:before="20" w:line="240" w:lineRule="auto"/>
+              <w:jc w:val="center"/>
+            </w:pPr>
+            <w:r>
+              <w:rPr>
+                <w:sz w:val="18"/>
+              </w:rPr>
+              <w:t>72.0</w:t>
+            </w:r>
+          </w:p>
+        </w:tc>
+        <w:tc>
+          <w:tcPr>
+            <w:tcW w:type="dxa" w:w="2304"/>
+          </w:tcPr>
+          <w:p>
+            <w:pPr>
+              <w:spacing w:after="20" w:before="20" w:line="240" w:lineRule="auto"/>
+              <w:jc w:val="center"/>
+            </w:pPr>
+            <w:r>
+              <w:rPr>
+                <w:sz w:val="18"/>
+              </w:rPr>
+              <w:t>+2.8 (+1.2 to +4.4)</w:t>
+            </w:r>
+          </w:p>
+        </w:tc>
+        <w:tc>
+          <w:tcPr>
+            <w:tcW w:type="dxa" w:w="2160"/>
+          </w:tcPr>
+          <w:p>
+            <w:pPr>
+              <w:spacing w:after="20" w:before="20" w:line="240" w:lineRule="auto"/>
+              <w:jc w:val="center"/>
+            </w:pPr>
+            <w:r>
+              <w:rPr>
+                <w:sz w:val="18"/>
+              </w:rPr>
+              <w:t>0.255, then 0.044</w:t>
+            </w:r>
+          </w:p>
+        </w:tc>
+      </w:tr>
+      <w:tr>
+        <w:trPr>
+          <w:cantSplit/>
+        </w:trPr>
+        <w:tc>
+          <w:tcPr>
+            <w:tcW w:type="dxa" w:w="3024"/>
+          </w:tcPr>
+          <w:p>
+            <w:pPr>
+              <w:spacing w:after="20" w:before="20" w:line="240" w:lineRule="auto"/>
+              <w:jc w:val="left"/>
+            </w:pPr>
+            <w:r>
+              <w:rPr>
+                <w:sz w:val="18"/>
+              </w:rPr>
+              <w:t>3 sources of a task type never trained on</w:t>
+            </w:r>
+          </w:p>
+        </w:tc>
+        <w:tc>
+          <w:tcPr>
+            <w:tcW w:type="dxa" w:w="1368"/>
+          </w:tcPr>
+          <w:p>
+            <w:pPr>
+              <w:spacing w:after="20" w:before="20" w:line="240" w:lineRule="auto"/>
+              <w:jc w:val="center"/>
+            </w:pPr>
+            <w:r>
+              <w:rPr>
+                <w:sz w:val="18"/>
+              </w:rPr>
+              <w:t>68.3</w:t>
+            </w:r>
+          </w:p>
+        </w:tc>
+        <w:tc>
+          <w:tcPr>
+            <w:tcW w:type="dxa" w:w="1368"/>
+          </w:tcPr>
+          <w:p>
+            <w:pPr>
+              <w:spacing w:after="20" w:before="20" w:line="240" w:lineRule="auto"/>
+              <w:jc w:val="center"/>
+            </w:pPr>
+            <w:r>
+              <w:rPr>
+                <w:sz w:val="18"/>
+              </w:rPr>
+              <w:t>70.0</w:t>
+            </w:r>
+          </w:p>
+        </w:tc>
+        <w:tc>
+          <w:tcPr>
+            <w:tcW w:type="dxa" w:w="2304"/>
+          </w:tcPr>
+          <w:p>
+            <w:pPr>
+              <w:spacing w:after="20" w:before="20" w:line="240" w:lineRule="auto"/>
+              <w:jc w:val="center"/>
+            </w:pPr>
+            <w:r>
+              <w:rPr>
+                <w:sz w:val="18"/>
+              </w:rPr>
+              <w:t>+1.7 (-1.3 to +4.3), could be chance</w:t>
+            </w:r>
+          </w:p>
+        </w:tc>
+        <w:tc>
+          <w:tcPr>
+            <w:tcW w:type="dxa" w:w="2160"/>
+          </w:tcPr>
+          <w:p>
+            <w:pPr>
+              <w:spacing w:after="20" w:before="20" w:line="240" w:lineRule="auto"/>
+              <w:jc w:val="center"/>
+            </w:pPr>
+            <w:r>
+              <w:rPr>
+                <w:sz w:val="18"/>
+              </w:rPr>
+              <w:t>0.266, then 0.070</w:t>
+            </w:r>
+          </w:p>
+        </w:tc>
+      </w:tr>
+      <w:tr>
+        <w:trPr>
+          <w:cantSplit/>
+        </w:trPr>
+        <w:tc>
+          <w:tcPr>
+            <w:tcW w:type="dxa" w:w="3024"/>
+            <w:tcBorders>
+              <w:bottom w:val="single" w:sz="12" w:space="0" w:color="000000"/>
+            </w:tcBorders>
+          </w:tcPr>
+          <w:p>
+            <w:pPr>
+              <w:spacing w:after="20" w:before="20" w:line="240" w:lineRule="auto"/>
+              <w:jc w:val="left"/>
+            </w:pPr>
+            <w:r>
+              <w:rPr>
+                <w:b/>
+                <w:sz w:val="18"/>
+              </w:rPr>
+              <w:t>All 14 together</w:t>
+            </w:r>
+          </w:p>
+        </w:tc>
+        <w:tc>
+          <w:tcPr>
+            <w:tcW w:type="dxa" w:w="1368"/>
+            <w:tcBorders>
+              <w:bottom w:val="single" w:sz="12" w:space="0" w:color="000000"/>
+            </w:tcBorders>
+          </w:tcPr>
+          <w:p>
+            <w:pPr>
+              <w:spacing w:after="20" w:before="20" w:line="240" w:lineRule="auto"/>
+              <w:jc w:val="center"/>
+            </w:pPr>
+            <w:r>
+              <w:rPr>
+                <w:b/>
+                <w:sz w:val="18"/>
+              </w:rPr>
+              <w:t>69.0</w:t>
+            </w:r>
+          </w:p>
+        </w:tc>
+        <w:tc>
+          <w:tcPr>
+            <w:tcW w:type="dxa" w:w="1368"/>
+            <w:tcBorders>
+              <w:bottom w:val="single" w:sz="12" w:space="0" w:color="000000"/>
+            </w:tcBorders>
+          </w:tcPr>
+          <w:p>
+            <w:pPr>
+              <w:spacing w:after="20" w:before="20" w:line="240" w:lineRule="auto"/>
+              <w:jc w:val="center"/>
+            </w:pPr>
+            <w:r>
+              <w:rPr>
+                <w:b/>
+                <w:sz w:val="18"/>
+              </w:rPr>
+              <w:t>71.5</w:t>
+            </w:r>
+          </w:p>
+        </w:tc>
+        <w:tc>
+          <w:tcPr>
+            <w:tcW w:type="dxa" w:w="2304"/>
+            <w:tcBorders>
+              <w:bottom w:val="single" w:sz="12" w:space="0" w:color="000000"/>
+            </w:tcBorders>
+          </w:tcPr>
+          <w:p>
+            <w:pPr>
+              <w:spacing w:after="20" w:before="20" w:line="240" w:lineRule="auto"/>
+              <w:jc w:val="center"/>
+            </w:pPr>
+            <w:r>
+              <w:rPr>
+                <w:b/>
+                <w:sz w:val="18"/>
+              </w:rPr>
+              <w:t>+2.5 (+1.1 to +4.1)</w:t>
+            </w:r>
+          </w:p>
+        </w:tc>
+        <w:tc>
+          <w:tcPr>
+            <w:tcW w:type="dxa" w:w="2160"/>
+            <w:tcBorders>
+              <w:bottom w:val="single" w:sz="12" w:space="0" w:color="000000"/>
+            </w:tcBorders>
+          </w:tcPr>
+          <w:p>
+            <w:pPr>
+              <w:spacing w:after="20" w:before="20" w:line="240" w:lineRule="auto"/>
+              <w:jc w:val="center"/>
+            </w:pPr>
+            <w:r>
+              <w:rPr>
+                <w:b/>
+                <w:sz w:val="18"/>
+              </w:rPr>
+              <w:t>0.257, then 0.047</w:t>
+            </w:r>
+          </w:p>
+        </w:tc>
+      </w:tr>
+    </w:tbl>
+    <w:p>
+      <w:pPr>
+        <w:keepNext w:val="0"/>
+        <w:spacing w:after="160" w:before="40"/>
+        <w:jc w:val="both"/>
+      </w:pPr>
+      <w:r>
+        <w:rPr>
+          <w:sz w:val="17"/>
+        </w:rPr>
+        <w:t>The untouched model has had the simple confidence adjustment (section 5) for the accuracy comparison. The certainty error of the untouched model is shown before that adjustment.</w:t>
+      </w:r>
+    </w:p>
+    <w:p>
+      <w:pPr>
+        <w:keepNext w:val="0"/>
+        <w:spacing w:after="80"/>
+      </w:pPr>
+      <w:r>
+        <w:rPr>
+          <w:sz w:val="22"/>
+        </w:rPr>
+        <w:t>The gain on unseen data is real but modest: about 2.5 points. It is not even across datasets. The fine-tuned model was better on 7 of the 14 datasets, equal on 1 and worse on 6. The largest gains were on tweet sentiment (+20 points), a sentence-pair logic task (+16) and a word-meaning task (+8). The largest drops were on tweet stance (-6) and tweet emotion (-5).</w:t>
       </w:r>
     </w:p>
     <w:p>
@@ -1018,6 +1495,62 @@
     </w:p>
     <w:p>
       <w:pPr>
+        <w:keepNext/>
+        <w:spacing w:after="40"/>
+        <w:jc w:val="center"/>
+      </w:pPr>
+      <w:r>
+        <w:drawing>
+          <wp:inline xmlns:a="http://schemas.openxmlformats.org/drawingml/2006/main" xmlns:pic="http://schemas.openxmlformats.org/drawingml/2006/picture">
+            <wp:extent cx="5760720" cy="2456778"/>
+            <wp:docPr id="2" name="Picture 2"/>
+            <wp:cNvGraphicFramePr>
+              <a:graphicFrameLocks noChangeAspect="1"/>
+            </wp:cNvGraphicFramePr>
+            <a:graphic>
+              <a:graphicData uri="http://schemas.openxmlformats.org/drawingml/2006/picture">
+                <pic:pic>
+                  <pic:nvPicPr>
+                    <pic:cNvPr id="0" name="fig_calibration.png"/>
+                    <pic:cNvPicPr/>
+                  </pic:nvPicPr>
+                  <pic:blipFill>
+                    <a:blip r:embed="rId12"/>
+                    <a:stretch>
+                      <a:fillRect/>
+                    </a:stretch>
+                  </pic:blipFill>
+                  <pic:spPr>
+                    <a:xfrm>
+                      <a:off x="0" y="0"/>
+                      <a:ext cx="5760720" cy="2456778"/>
+                    </a:xfrm>
+                    <a:prstGeom prst="rect"/>
+                  </pic:spPr>
+                </pic:pic>
+              </a:graphicData>
+            </a:graphic>
+          </wp:inline>
+        </w:drawing>
+      </w:r>
+    </w:p>
+    <w:p>
+      <w:pPr>
+        <w:pStyle w:val="Caption"/>
+      </w:pPr>
+      <w:r>
+        <w:rPr>
+          <w:b/>
+        </w:rPr>
+        <w:t>Figure 2.</w:t>
+      </w:r>
+      <w:r>
+        <w:rPr/>
+        <w:t xml:space="preserve"> Does the model's stated certainty match reality? Each bar groups questions by how sure the model said it was (left to right: unsure to very sure) and shows how often it was actually right. Bars on the dashed line mean the stated certainty is honest. Data: the 14 unseen datasets.</w:t>
+      </w:r>
+    </w:p>
+    <w:p>
+      <w:pPr>
         <w:pStyle w:val="Caption"/>
         <w:keepNext/>
       </w:pPr>
@@ -1025,11 +1558,11 @@
         <w:rPr>
           <w:b/>
         </w:rPr>
-        <w:t>Table 2.</w:t>
+        <w:t>Table 3.</w:t>
       </w:r>
       <w:r>
         <w:rPr/>
-        <w:t xml:space="preserve"> Error between stated certainty and actual accuracy (lower is better), on the 16 development datasets.</w:t>
+        <w:t xml:space="preserve"> Error between stated certainty and actual accuracy (lower is better), on the 14 unseen datasets.</w:t>
       </w:r>
     </w:p>
     <w:tbl>
@@ -1052,7 +1585,7 @@
         </w:trPr>
         <w:tc>
           <w:tcPr>
-            <w:tcW w:type="dxa" w:w="2160"/>
+            <w:tcW w:type="dxa" w:w="2592"/>
             <w:tcBorders>
               <w:top w:val="single" w:sz="12" w:space="0" w:color="000000"/>
               <w:bottom w:val="single" w:sz="6" w:space="0" w:color="000000"/>
@@ -1138,7 +1671,153 @@
         </w:trPr>
         <w:tc>
           <w:tcPr>
+            <w:tcW w:type="dxa" w:w="2592"/>
+          </w:tcPr>
+          <w:p>
+            <w:pPr>
+              <w:spacing w:after="20" w:before="20" w:line="240" w:lineRule="auto"/>
+              <w:jc w:val="left"/>
+            </w:pPr>
+            <w:r>
+              <w:rPr>
+                <w:sz w:val="19"/>
+              </w:rPr>
+              <w:t>Certainty error</w:t>
+            </w:r>
+          </w:p>
+        </w:tc>
+        <w:tc>
+          <w:tcPr>
             <w:tcW w:type="dxa" w:w="2160"/>
+          </w:tcPr>
+          <w:p>
+            <w:pPr>
+              <w:spacing w:after="20" w:before="20" w:line="240" w:lineRule="auto"/>
+              <w:jc w:val="center"/>
+            </w:pPr>
+            <w:r>
+              <w:rPr>
+                <w:sz w:val="19"/>
+              </w:rPr>
+              <w:t>0.257</w:t>
+            </w:r>
+          </w:p>
+        </w:tc>
+        <w:tc>
+          <w:tcPr>
+            <w:tcW w:type="dxa" w:w="2592"/>
+          </w:tcPr>
+          <w:p>
+            <w:pPr>
+              <w:spacing w:after="20" w:before="20" w:line="240" w:lineRule="auto"/>
+              <w:jc w:val="center"/>
+            </w:pPr>
+            <w:r>
+              <w:rPr>
+                <w:sz w:val="19"/>
+              </w:rPr>
+              <w:t>0.095</w:t>
+            </w:r>
+          </w:p>
+        </w:tc>
+        <w:tc>
+          <w:tcPr>
+            <w:tcW w:type="dxa" w:w="2592"/>
+          </w:tcPr>
+          <w:p>
+            <w:pPr>
+              <w:spacing w:after="20" w:before="20" w:line="240" w:lineRule="auto"/>
+              <w:jc w:val="center"/>
+            </w:pPr>
+            <w:r>
+              <w:rPr>
+                <w:sz w:val="19"/>
+              </w:rPr>
+              <w:t>0.047</w:t>
+            </w:r>
+          </w:p>
+        </w:tc>
+      </w:tr>
+      <w:tr>
+        <w:trPr>
+          <w:cantSplit/>
+        </w:trPr>
+        <w:tc>
+          <w:tcPr>
+            <w:tcW w:type="dxa" w:w="2592"/>
+          </w:tcPr>
+          <w:p>
+            <w:pPr>
+              <w:spacing w:after="20" w:before="20" w:line="240" w:lineRule="auto"/>
+              <w:jc w:val="left"/>
+            </w:pPr>
+            <w:r>
+              <w:rPr>
+                <w:sz w:val="19"/>
+              </w:rPr>
+              <w:t>Average stated certainty (%)</w:t>
+            </w:r>
+          </w:p>
+        </w:tc>
+        <w:tc>
+          <w:tcPr>
+            <w:tcW w:type="dxa" w:w="2160"/>
+          </w:tcPr>
+          <w:p>
+            <w:pPr>
+              <w:spacing w:after="20" w:before="20" w:line="240" w:lineRule="auto"/>
+              <w:jc w:val="center"/>
+            </w:pPr>
+            <w:r>
+              <w:rPr>
+                <w:sz w:val="19"/>
+              </w:rPr>
+              <w:t>94.7</w:t>
+            </w:r>
+          </w:p>
+        </w:tc>
+        <w:tc>
+          <w:tcPr>
+            <w:tcW w:type="dxa" w:w="2592"/>
+          </w:tcPr>
+          <w:p>
+            <w:pPr>
+              <w:spacing w:after="20" w:before="20" w:line="240" w:lineRule="auto"/>
+              <w:jc w:val="center"/>
+            </w:pPr>
+            <w:r>
+              <w:rPr>
+                <w:sz w:val="19"/>
+              </w:rPr>
+              <w:t>77.5</w:t>
+            </w:r>
+          </w:p>
+        </w:tc>
+        <w:tc>
+          <w:tcPr>
+            <w:tcW w:type="dxa" w:w="2592"/>
+          </w:tcPr>
+          <w:p>
+            <w:pPr>
+              <w:spacing w:after="20" w:before="20" w:line="240" w:lineRule="auto"/>
+              <w:jc w:val="center"/>
+            </w:pPr>
+            <w:r>
+              <w:rPr>
+                <w:sz w:val="19"/>
+              </w:rPr>
+              <w:t>76.1</w:t>
+            </w:r>
+          </w:p>
+        </w:tc>
+      </w:tr>
+      <w:tr>
+        <w:trPr>
+          <w:cantSplit/>
+        </w:trPr>
+        <w:tc>
+          <w:tcPr>
+            <w:tcW w:type="dxa" w:w="2592"/>
             <w:tcBorders>
               <w:bottom w:val="single" w:sz="12" w:space="0" w:color="000000"/>
             </w:tcBorders>
@@ -1152,7 +1831,7 @@
               <w:rPr>
                 <w:sz w:val="19"/>
               </w:rPr>
-              <w:t>Certainty error</w:t>
+              <w:t>Actually correct (%)</w:t>
             </w:r>
           </w:p>
         </w:tc>
@@ -1172,7 +1851,7 @@
               <w:rPr>
                 <w:sz w:val="19"/>
               </w:rPr>
-              <w:t>0.240</w:t>
+              <w:t>69.0</w:t>
             </w:r>
           </w:p>
         </w:tc>
@@ -1192,7 +1871,7 @@
               <w:rPr>
                 <w:sz w:val="19"/>
               </w:rPr>
-              <w:t>0.068</w:t>
+              <w:t>69.0</w:t>
             </w:r>
           </w:p>
         </w:tc>
@@ -1212,7 +1891,7 @@
               <w:rPr>
                 <w:sz w:val="19"/>
               </w:rPr>
-              <w:t>0.043</w:t>
+              <w:t>71.5</w:t>
             </w:r>
           </w:p>
         </w:tc>
@@ -1228,7 +1907,12 @@
         <w:rPr>
           <w:sz w:val="17"/>
         </w:rPr>
-        <w:t>The simple temperature fix alone removes most of the untouched model's overconfidence. Training adds a smaller improvement on top.</w:t>
+        <w:t>The untouched model claims about 95% certainty but is right about 69% of the time. The simple temperature fix removes most of that overconfidence, and training halves the remaining error.</w:t>
+      </w:r>
+    </w:p>
+    <w:p>
+      <w:r>
+        <w:br w:type="page"/>
       </w:r>
     </w:p>
     <w:p>

</xml_diff>